<commit_message>
version v4 (in progress)
</commit_message>
<xml_diff>
--- a/paper/ElasticBounds-r_v4.docx
+++ b/paper/ElasticBounds-r_v4.docx
@@ -42,7 +42,7 @@
         <w:pStyle w:val="Date"/>
       </w:pPr>
       <w:r>
-        <w:t xml:space="preserve">24, July 2025</w:t>
+        <w:t xml:space="preserve">02, August 2025</w:t>
       </w:r>
     </w:p>
     <w:p>
@@ -82,7 +82,36 @@
         </w:numPr>
       </w:pPr>
       <w:r>
-        <w:t xml:space="preserve">Overview of limitations in current correlation testing with ordinal data</w:t>
+        <w:t xml:space="preserve">Overview of limitations in current correlation testing with ordinal</w:t>
+      </w:r>
+    </w:p>
+    <w:p>
+      <w:pPr>
+        <w:pStyle w:val="Compact"/>
+        <w:numPr>
+          <w:ilvl w:val="0"/>
+          <w:numId w:val="1002"/>
+        </w:numPr>
+      </w:pPr>
+      <w:r>
+        <w:t xml:space="preserve">Why does this matter?</w:t>
+      </w:r>
+      <w:r>
+        <w:t xml:space="preserve"> </w:t>
+      </w:r>
+      <m:oMath>
+        <m:r>
+          <m:rPr>
+            <m:sty m:val="p"/>
+          </m:rPr>
+          <m:t>⤳</m:t>
+        </m:r>
+      </m:oMath>
+      <w:r>
+        <w:t xml:space="preserve"> </w:t>
+      </w:r>
+      <w:r>
+        <w:t xml:space="preserve">consequences if these changing bounds are ignored</w:t>
       </w:r>
     </w:p>
     <w:p>
@@ -129,12 +158,12 @@
       <w:pPr>
         <w:pStyle w:val="Compact"/>
         <w:numPr>
-          <w:ilvl w:val="0"/>
-          <w:numId w:val="1004"/>
+          <w:ilvl w:val="1"/>
+          <w:numId w:val="1005"/>
         </w:numPr>
       </w:pPr>
       <w:r>
-        <w:t xml:space="preserve">Implications for standard significance tests</w:t>
+        <w:t xml:space="preserve">Atainable and non-atainable bounds</w:t>
       </w:r>
     </w:p>
     <w:p>
@@ -146,7 +175,7 @@
         </w:numPr>
       </w:pPr>
       <w:r>
-        <w:t xml:space="preserve">Note on Freshet bounds anomaly (appendix or highlighted sidebar)</w:t>
+        <w:t xml:space="preserve">Implications for standard significance tests</w:t>
       </w:r>
     </w:p>
     <w:p>
@@ -154,7 +183,19 @@
         <w:pStyle w:val="Compact"/>
         <w:numPr>
           <w:ilvl w:val="0"/>
-          <w:numId w:val="1005"/>
+          <w:numId w:val="1004"/>
+        </w:numPr>
+      </w:pPr>
+      <w:r>
+        <w:t xml:space="preserve">Note on Freshet bounds anomaly (appendix or highlighted sidebar)</w:t>
+      </w:r>
+    </w:p>
+    <w:p>
+      <w:pPr>
+        <w:pStyle w:val="Compact"/>
+        <w:numPr>
+          <w:ilvl w:val="0"/>
+          <w:numId w:val="1006"/>
         </w:numPr>
       </w:pPr>
       <w:r>
@@ -176,7 +217,7 @@
         <w:pStyle w:val="Compact"/>
         <w:numPr>
           <w:ilvl w:val="0"/>
-          <w:numId w:val="1006"/>
+          <w:numId w:val="1007"/>
         </w:numPr>
       </w:pPr>
       <w:r>
@@ -188,7 +229,7 @@
         <w:pStyle w:val="Compact"/>
         <w:numPr>
           <w:ilvl w:val="0"/>
-          <w:numId w:val="1006"/>
+          <w:numId w:val="1007"/>
         </w:numPr>
       </w:pPr>
       <w:r>
@@ -200,7 +241,7 @@
         <w:pStyle w:val="Compact"/>
         <w:numPr>
           <w:ilvl w:val="0"/>
-          <w:numId w:val="1006"/>
+          <w:numId w:val="1007"/>
         </w:numPr>
       </w:pPr>
       <w:r>
@@ -212,7 +253,7 @@
         <w:pStyle w:val="Compact"/>
         <w:numPr>
           <w:ilvl w:val="0"/>
-          <w:numId w:val="1006"/>
+          <w:numId w:val="1007"/>
         </w:numPr>
       </w:pPr>
       <w:r>
@@ -237,7 +278,7 @@
         <w:pStyle w:val="Compact"/>
         <w:numPr>
           <w:ilvl w:val="0"/>
-          <w:numId w:val="1007"/>
+          <w:numId w:val="1008"/>
         </w:numPr>
       </w:pPr>
       <w:r>
@@ -253,35 +294,11 @@
         <w:pStyle w:val="Compact"/>
         <w:numPr>
           <w:ilvl w:val="0"/>
-          <w:numId w:val="1008"/>
+          <w:numId w:val="1009"/>
         </w:numPr>
       </w:pPr>
       <w:r>
         <w:t xml:space="preserve">Design of permutation and Monte Carlo simulations</w:t>
-      </w:r>
-    </w:p>
-    <w:p>
-      <w:pPr>
-        <w:pStyle w:val="Compact"/>
-        <w:numPr>
-          <w:ilvl w:val="0"/>
-          <w:numId w:val="1008"/>
-        </w:numPr>
-      </w:pPr>
-      <w:r>
-        <w:t xml:space="preserve">Bias and error analysis under null hypotheses</w:t>
-      </w:r>
-    </w:p>
-    <w:p>
-      <w:pPr>
-        <w:pStyle w:val="Compact"/>
-        <w:numPr>
-          <w:ilvl w:val="0"/>
-          <w:numId w:val="1008"/>
-        </w:numPr>
-      </w:pPr>
-      <w:r>
-        <w:t xml:space="preserve">Role of mean, skewness, variance in predicting constraint metrics</w:t>
       </w:r>
     </w:p>
     <w:p>
@@ -293,6 +310,30 @@
         </w:numPr>
       </w:pPr>
       <w:r>
+        <w:t xml:space="preserve">Bias and error analysis under null hypotheses</w:t>
+      </w:r>
+    </w:p>
+    <w:p>
+      <w:pPr>
+        <w:pStyle w:val="Compact"/>
+        <w:numPr>
+          <w:ilvl w:val="0"/>
+          <w:numId w:val="1009"/>
+        </w:numPr>
+      </w:pPr>
+      <w:r>
+        <w:t xml:space="preserve">Role of mean, skewness, variance in predicting constraint metrics</w:t>
+      </w:r>
+    </w:p>
+    <w:p>
+      <w:pPr>
+        <w:pStyle w:val="Compact"/>
+        <w:numPr>
+          <w:ilvl w:val="0"/>
+          <w:numId w:val="1010"/>
+        </w:numPr>
+      </w:pPr>
+      <w:r>
         <w:rPr>
           <w:b/>
           <w:bCs/>
@@ -305,35 +346,11 @@
         <w:pStyle w:val="Compact"/>
         <w:numPr>
           <w:ilvl w:val="0"/>
-          <w:numId w:val="1010"/>
+          <w:numId w:val="1011"/>
         </w:numPr>
       </w:pPr>
       <w:r>
         <w:t xml:space="preserve">Justification for selection: a typical but not representative case</w:t>
-      </w:r>
-    </w:p>
-    <w:p>
-      <w:pPr>
-        <w:pStyle w:val="Compact"/>
-        <w:numPr>
-          <w:ilvl w:val="0"/>
-          <w:numId w:val="1010"/>
-        </w:numPr>
-      </w:pPr>
-      <w:r>
-        <w:t xml:space="preserve">Application of shrinkage and constraint metrics to BES</w:t>
-      </w:r>
-    </w:p>
-    <w:p>
-      <w:pPr>
-        <w:pStyle w:val="Compact"/>
-        <w:numPr>
-          <w:ilvl w:val="0"/>
-          <w:numId w:val="1010"/>
-        </w:numPr>
-      </w:pPr>
-      <w:r>
-        <w:t xml:space="preserve">Comparison to simulation outcomes</w:t>
       </w:r>
     </w:p>
     <w:p>
@@ -345,6 +362,30 @@
         </w:numPr>
       </w:pPr>
       <w:r>
+        <w:t xml:space="preserve">Application of shrinkage and constraint metrics to BES</w:t>
+      </w:r>
+    </w:p>
+    <w:p>
+      <w:pPr>
+        <w:pStyle w:val="Compact"/>
+        <w:numPr>
+          <w:ilvl w:val="0"/>
+          <w:numId w:val="1011"/>
+        </w:numPr>
+      </w:pPr>
+      <w:r>
+        <w:t xml:space="preserve">Comparison to simulation outcomes</w:t>
+      </w:r>
+    </w:p>
+    <w:p>
+      <w:pPr>
+        <w:pStyle w:val="Compact"/>
+        <w:numPr>
+          <w:ilvl w:val="0"/>
+          <w:numId w:val="1012"/>
+        </w:numPr>
+      </w:pPr>
+      <w:r>
         <w:rPr>
           <w:b/>
           <w:bCs/>
@@ -357,35 +398,11 @@
         <w:pStyle w:val="Compact"/>
         <w:numPr>
           <w:ilvl w:val="0"/>
-          <w:numId w:val="1012"/>
-        </w:numPr>
-      </w:pPr>
-      <w:r>
-        <w:t xml:space="preserve">Critique of statistical purism in significance testing</w:t>
-      </w:r>
-    </w:p>
-    <w:p>
-      <w:pPr>
-        <w:pStyle w:val="Compact"/>
-        <w:numPr>
-          <w:ilvl w:val="1"/>
           <w:numId w:val="1013"/>
         </w:numPr>
       </w:pPr>
       <w:r>
-        <w:t xml:space="preserve">Critique of over-reliance on significance without consideration of boundedness or constraint metrics.</w:t>
-      </w:r>
-    </w:p>
-    <w:p>
-      <w:pPr>
-        <w:pStyle w:val="Compact"/>
-        <w:numPr>
-          <w:ilvl w:val="0"/>
-          <w:numId w:val="1012"/>
-        </w:numPr>
-      </w:pPr>
-      <w:r>
-        <w:t xml:space="preserve">Reframing effect size: from absolute value to bounded context</w:t>
+        <w:t xml:space="preserve">Critique of statistical purism in significance testing</w:t>
       </w:r>
     </w:p>
     <w:p>
@@ -396,25 +413,8 @@
           <w:numId w:val="1014"/>
         </w:numPr>
       </w:pPr>
-      <m:oMath>
-        <m:sSup>
-          <m:e>
-            <m:r>
-              <m:t>r</m:t>
-            </m:r>
-          </m:e>
-          <m:sup>
-            <m:r>
-              <m:t>2</m:t>
-            </m:r>
-          </m:sup>
-        </m:sSup>
-      </m:oMath>
-      <w:r>
-        <w:t xml:space="preserve"> </w:t>
-      </w:r>
-      <w:r>
-        <w:t xml:space="preserve">interpretation under bounded conditions</w:t>
+      <w:r>
+        <w:t xml:space="preserve">Critique of over-reliance on significance without consideration of boundedness or constraint metrics.</w:t>
       </w:r>
     </w:p>
     <w:p>
@@ -422,11 +422,11 @@
         <w:pStyle w:val="Compact"/>
         <w:numPr>
           <w:ilvl w:val="0"/>
-          <w:numId w:val="1012"/>
+          <w:numId w:val="1013"/>
         </w:numPr>
       </w:pPr>
       <w:r>
-        <w:t xml:space="preserve">RE-SCALING:</w:t>
+        <w:t xml:space="preserve">Reframing effect size: from absolute value to bounded context</w:t>
       </w:r>
     </w:p>
     <w:p>
@@ -437,6 +437,47 @@
           <w:numId w:val="1015"/>
         </w:numPr>
       </w:pPr>
+      <m:oMath>
+        <m:sSup>
+          <m:e>
+            <m:r>
+              <m:t>r</m:t>
+            </m:r>
+          </m:e>
+          <m:sup>
+            <m:r>
+              <m:t>2</m:t>
+            </m:r>
+          </m:sup>
+        </m:sSup>
+      </m:oMath>
+      <w:r>
+        <w:t xml:space="preserve"> </w:t>
+      </w:r>
+      <w:r>
+        <w:t xml:space="preserve">interpretation under bounded conditions</w:t>
+      </w:r>
+    </w:p>
+    <w:p>
+      <w:pPr>
+        <w:pStyle w:val="Compact"/>
+        <w:numPr>
+          <w:ilvl w:val="0"/>
+          <w:numId w:val="1013"/>
+        </w:numPr>
+      </w:pPr>
+      <w:r>
+        <w:t xml:space="preserve">RE-SCALING:</w:t>
+      </w:r>
+    </w:p>
+    <w:p>
+      <w:pPr>
+        <w:pStyle w:val="Compact"/>
+        <w:numPr>
+          <w:ilvl w:val="1"/>
+          <w:numId w:val="1016"/>
+        </w:numPr>
+      </w:pPr>
       <w:r>
         <w:t xml:space="preserve">Map</w:t>
       </w:r>
@@ -475,7 +516,7 @@
         <w:pStyle w:val="Compact"/>
         <w:numPr>
           <w:ilvl w:val="1"/>
-          <w:numId w:val="1015"/>
+          <w:numId w:val="1016"/>
         </w:numPr>
       </w:pPr>
       <w:r>
@@ -583,7 +624,7 @@
         <w:pStyle w:val="Compact"/>
         <w:numPr>
           <w:ilvl w:val="1"/>
-          <w:numId w:val="1016"/>
+          <w:numId w:val="1017"/>
         </w:numPr>
       </w:pPr>
       <w:r>
@@ -634,7 +675,7 @@
         <w:pStyle w:val="Compact"/>
         <w:numPr>
           <w:ilvl w:val="0"/>
-          <w:numId w:val="1012"/>
+          <w:numId w:val="1013"/>
         </w:numPr>
       </w:pPr>
       <w:r>
@@ -646,7 +687,7 @@
         <w:pStyle w:val="Compact"/>
         <w:numPr>
           <w:ilvl w:val="0"/>
-          <w:numId w:val="1012"/>
+          <w:numId w:val="1013"/>
         </w:numPr>
       </w:pPr>
       <w:r>
@@ -657,7 +698,7 @@
       <w:pPr>
         <w:numPr>
           <w:ilvl w:val="0"/>
-          <w:numId w:val="1017"/>
+          <w:numId w:val="1018"/>
         </w:numPr>
       </w:pPr>
       <w:r>
@@ -672,7 +713,7 @@
       <w:pPr>
         <w:numPr>
           <w:ilvl w:val="0"/>
-          <w:numId w:val="1017"/>
+          <w:numId w:val="1018"/>
         </w:numPr>
       </w:pPr>
       <w:r>
@@ -684,14 +725,6 @@
       </w:r>
     </w:p>
     <w:p>
-      <w:pPr>
-        <w:pStyle w:val="FirstParagraph"/>
-      </w:pPr>
-      <w:r>
-        <w:t xml:space="preserve">(Hardy et al., 1952)</w:t>
-      </w:r>
-    </w:p>
-    <w:p>
       <w:r>
         <w:br w:type="page"/>
       </w:r>
@@ -701,56 +734,13 @@
         <w:br w:type="page"/>
       </w:r>
     </w:p>
-    <w:bookmarkStart w:id="23" w:name="preamble"/>
+    <w:bookmarkStart w:id="20" w:name="to-do"/>
     <w:p>
       <w:pPr>
         <w:pStyle w:val="Heading1"/>
       </w:pPr>
       <w:r>
-        <w:t xml:space="preserve">1. Preamble</w:t>
-      </w:r>
-    </w:p>
-    <w:bookmarkStart w:id="20" w:name="the-point"/>
-    <w:p>
-      <w:pPr>
-        <w:pStyle w:val="Heading2"/>
-      </w:pPr>
-      <w:r>
-        <w:t xml:space="preserve">1.1 The</w:t>
-      </w:r>
-      <w:r>
-        <w:t xml:space="preserve"> </w:t>
-      </w:r>
-      <w:r>
-        <w:t xml:space="preserve">‘Point’</w:t>
-      </w:r>
-      <w:r>
-        <w:t xml:space="preserve">:</w:t>
-      </w:r>
-    </w:p>
-    <w:p>
-      <w:pPr>
-        <w:pStyle w:val="FirstParagraph"/>
-      </w:pPr>
-      <w:r>
-        <w:t xml:space="preserve">The widespread use of Pearson’s</w:t>
-      </w:r>
-      <w:r>
-        <w:t xml:space="preserve"> </w:t>
-      </w:r>
-      <m:oMath>
-        <m:r>
-          <m:t>r</m:t>
-        </m:r>
-      </m:oMath>
-      <w:r>
-        <w:t xml:space="preserve"> </w:t>
-      </w:r>
-      <w:r>
-        <w:t xml:space="preserve">with ordinal data.</w:t>
-      </w:r>
-      <w:r>
-        <w:br/>
+        <w:t xml:space="preserve">1. To Do</w:t>
       </w:r>
     </w:p>
     <w:p>
@@ -758,95 +748,144 @@
         <w:pStyle w:val="Compact"/>
         <w:numPr>
           <w:ilvl w:val="0"/>
-          <w:numId w:val="1018"/>
+          <w:numId w:val="1019"/>
         </w:numPr>
       </w:pPr>
+      <w:r>
+        <w:t xml:space="preserve">Can</w:t>
+      </w:r>
+      <w:r>
+        <w:t xml:space="preserve"> </w:t>
+      </w:r>
+      <m:oMath>
+        <m:sSub>
+          <m:e>
+            <m:r>
+              <m:t>r</m:t>
+            </m:r>
+          </m:e>
+          <m:sub>
+            <m:r>
+              <m:t>m</m:t>
+            </m:r>
+            <m:r>
+              <m:t>i</m:t>
+            </m:r>
+            <m:r>
+              <m:t>n</m:t>
+            </m:r>
+          </m:sub>
+        </m:sSub>
+        <m:r>
+          <m:rPr>
+            <m:sty m:val="p"/>
+          </m:rPr>
+          <m:t>&gt;</m:t>
+        </m:r>
+        <m:r>
+          <m:t>0</m:t>
+        </m:r>
+      </m:oMath>
+      <w:r>
+        <w:t xml:space="preserve">?</w:t>
+      </w:r>
+    </w:p>
+    <w:p>
+      <w:pPr>
+        <w:pStyle w:val="Compact"/>
+        <w:numPr>
+          <w:ilvl w:val="0"/>
+          <w:numId w:val="1019"/>
+        </w:numPr>
+      </w:pPr>
+      <w:r>
+        <w:t xml:space="preserve">Show</w:t>
+      </w:r>
+      <w:r>
+        <w:t xml:space="preserve"> </w:t>
+      </w:r>
+      <m:oMath>
+        <m:d>
+          <m:dPr>
+            <m:begChr m:val="|"/>
+            <m:endChr m:val="|"/>
+            <m:sepChr m:val=""/>
+            <m:grow/>
+          </m:dPr>
+          <m:e>
+            <m:sSub>
+              <m:e>
+                <m:r>
+                  <m:t>r</m:t>
+                </m:r>
+              </m:e>
+              <m:sub>
+                <m:r>
+                  <m:t>m</m:t>
+                </m:r>
+                <m:r>
+                  <m:t>i</m:t>
+                </m:r>
+                <m:r>
+                  <m:t>n</m:t>
+                </m:r>
+              </m:sub>
+            </m:sSub>
+          </m:e>
+        </m:d>
+        <m:r>
+          <m:rPr>
+            <m:sty m:val="p"/>
+          </m:rPr>
+          <m:t>≥</m:t>
+        </m:r>
+        <m:sSub>
+          <m:e>
+            <m:r>
+              <m:t>r</m:t>
+            </m:r>
+          </m:e>
+          <m:sub>
+            <m:r>
+              <m:t>m</m:t>
+            </m:r>
+            <m:r>
+              <m:t>a</m:t>
+            </m:r>
+            <m:r>
+              <m:t>x</m:t>
+            </m:r>
+          </m:sub>
+        </m:sSub>
+      </m:oMath>
+      <w:r>
+        <w:t xml:space="preserve"> </w:t>
+      </w:r>
       <w:r>
         <w:rPr>
           <w:i/>
           <w:iCs/>
         </w:rPr>
-        <w:t xml:space="preserve">Alert</w:t>
-      </w:r>
-      <w:r>
-        <w:t xml:space="preserve"> </w:t>
-      </w:r>
-      <w:r>
-        <w:t xml:space="preserve">applied researachers of</w:t>
-      </w:r>
-      <w:r>
-        <w:t xml:space="preserve"> </w:t>
-      </w:r>
-      <w:r>
-        <w:t xml:space="preserve">‘elastic bounds’</w:t>
-      </w:r>
-    </w:p>
-    <w:p>
-      <w:pPr>
-        <w:pStyle w:val="Compact"/>
-        <w:numPr>
-          <w:ilvl w:val="1"/>
-          <w:numId w:val="1019"/>
-        </w:numPr>
-      </w:pPr>
-      <w:r>
-        <w:t xml:space="preserve">Problems of ignoring the above</w:t>
-      </w:r>
-      <w:r>
-        <w:t xml:space="preserve"> </w:t>
-      </w:r>
-      <m:oMath>
-        <m:r>
-          <m:rPr>
-            <m:sty m:val="p"/>
-          </m:rPr>
-          <m:t>⤳</m:t>
-        </m:r>
-      </m:oMath>
-      <w:r>
-        <w:t xml:space="preserve"> </w:t>
-      </w:r>
-      <w:r>
-        <w:t xml:space="preserve">errors in interpretation (e.g. Cohen and Cohen) – how max/min bounds of</w:t>
-      </w:r>
-      <w:r>
-        <w:t xml:space="preserve"> </w:t>
-      </w:r>
-      <m:oMath>
-        <m:r>
-          <m:t>r</m:t>
-        </m:r>
-      </m:oMath>
-      <w:r>
-        <w:t xml:space="preserve"> </w:t>
-      </w:r>
-      <w:r>
-        <w:t xml:space="preserve">vary with marginals.</w:t>
-      </w:r>
-      <w:r>
-        <w:br/>
-      </w:r>
-    </w:p>
-    <w:p>
-      <w:pPr>
-        <w:pStyle w:val="Compact"/>
-        <w:numPr>
-          <w:ilvl w:val="0"/>
-          <w:numId w:val="1018"/>
-        </w:numPr>
-      </w:pPr>
+        <w:t xml:space="preserve">in the population</w:t>
+      </w:r>
+      <w:r>
+        <w:t xml:space="preserve">. Discuss how this is often violated by</w:t>
+      </w:r>
+      <w:r>
+        <w:t xml:space="preserve"> </w:t>
+      </w:r>
       <w:r>
         <w:rPr>
           <w:i/>
           <w:iCs/>
         </w:rPr>
-        <w:t xml:space="preserve">Provide</w:t>
-      </w:r>
-      <w:r>
-        <w:t xml:space="preserve"> </w:t>
-      </w:r>
-      <w:r>
-        <w:t xml:space="preserve">tools to assess if problems exist in own data/ research</w:t>
+        <w:t xml:space="preserve">estimates</w:t>
+      </w:r>
+      <w:r>
+        <w:t xml:space="preserve"> </w:t>
+      </w:r>
+      <w:r>
+        <w:t xml:space="preserve">of these quantities (Cees and BES pairs)</w:t>
       </w:r>
     </w:p>
     <w:p>
@@ -854,21 +893,11 @@
         <w:pStyle w:val="Compact"/>
         <w:numPr>
           <w:ilvl w:val="0"/>
-          <w:numId w:val="1018"/>
+          <w:numId w:val="1019"/>
         </w:numPr>
       </w:pPr>
       <w:r>
-        <w:rPr>
-          <w:i/>
-          <w:iCs/>
-        </w:rPr>
-        <w:t xml:space="preserve">Clarify</w:t>
-      </w:r>
-      <w:r>
-        <w:t xml:space="preserve"> </w:t>
-      </w:r>
-      <w:r>
-        <w:t xml:space="preserve">that traditional hypothesis testing (e.g. t-test of</w:t>
+        <w:t xml:space="preserve">Are there systematic biases in testing</w:t>
       </w:r>
       <w:r>
         <w:t xml:space="preserve"> </w:t>
@@ -906,496 +935,113 @@
         </m:r>
       </m:oMath>
       <w:r>
-        <w:t xml:space="preserve">) are incorrect and provide correct hypo testing (permutation/ randomization tests)</w:t>
+        <w:t xml:space="preserve"> </w:t>
+      </w:r>
+      <w:r>
+        <w:t xml:space="preserve">using t-test? (Answer with Monte Carlo simulated data?)</w:t>
+      </w:r>
+    </w:p>
+    <w:p>
+      <w:pPr>
+        <w:pStyle w:val="Compact"/>
+        <w:numPr>
+          <w:ilvl w:val="0"/>
+          <w:numId w:val="1019"/>
+        </w:numPr>
+      </w:pPr>
+      <w:r>
+        <w:t xml:space="preserve">Add: “</w:t>
+      </w:r>
+      <m:oMath>
+        <m:sSub>
+          <m:e>
+            <m:r>
+              <m:t>r</m:t>
+            </m:r>
+          </m:e>
+          <m:sub>
+            <m:r>
+              <m:t>m</m:t>
+            </m:r>
+          </m:sub>
+        </m:sSub>
+        <m:r>
+          <m:t>i</m:t>
+        </m:r>
+        <m:r>
+          <m:t>n</m:t>
+        </m:r>
+      </m:oMath>
+      <w:r>
+        <w:t xml:space="preserve"> </w:t>
+      </w:r>
+      <w:r>
+        <w:t xml:space="preserve">is invariant to</w:t>
+      </w:r>
+      <w:r>
+        <w:t xml:space="preserve"> </w:t>
+      </w:r>
+      <w:r>
+        <w:t xml:space="preserve">‘problem 1’</w:t>
+      </w:r>
+      <w:r>
+        <w:t xml:space="preserve"> </w:t>
+      </w:r>
+      <w:r>
+        <w:t xml:space="preserve">(value assignment. So using ranks is actually w.l.o.g.)</w:t>
       </w:r>
     </w:p>
     <w:bookmarkEnd w:id="20"/>
-    <w:bookmarkStart w:id="21" w:name="contributions"/>
+    <w:bookmarkStart w:id="24" w:name="preamble"/>
+    <w:p>
+      <w:pPr>
+        <w:pStyle w:val="Heading1"/>
+      </w:pPr>
+      <w:r>
+        <w:t xml:space="preserve">2. Preamble</w:t>
+      </w:r>
+    </w:p>
+    <w:bookmarkStart w:id="21" w:name="the-point"/>
     <w:p>
       <w:pPr>
         <w:pStyle w:val="Heading2"/>
       </w:pPr>
       <w:r>
-        <w:t xml:space="preserve">1.2 Contributions:</w:t>
-      </w:r>
-    </w:p>
-    <w:p>
-      <w:pPr>
-        <w:pStyle w:val="SourceCode"/>
-      </w:pPr>
-      <w:r>
-        <w:rPr>
-          <w:rStyle w:val="VerbatimChar"/>
-        </w:rPr>
-        <w:t xml:space="preserve">1.  Theory of optimal bounds\</w:t>
+        <w:t xml:space="preserve">2.1 The</w:t>
+      </w:r>
+      <w:r>
+        <w:t xml:space="preserve"> </w:t>
+      </w:r>
+      <w:r>
+        <w:t xml:space="preserve">‘Point’</w:t>
+      </w:r>
+      <w:r>
+        <w:t xml:space="preserve">:</w:t>
+      </w:r>
+    </w:p>
+    <w:p>
+      <w:pPr>
+        <w:pStyle w:val="FirstParagraph"/>
+      </w:pPr>
+      <w:r>
+        <w:t xml:space="preserve">The widespread use of Pearson’s</w:t>
+      </w:r>
+      <w:r>
+        <w:t xml:space="preserve"> </w:t>
+      </w:r>
+      <m:oMath>
+        <m:r>
+          <m:t>r</m:t>
+        </m:r>
+      </m:oMath>
+      <w:r>
+        <w:t xml:space="preserve"> </w:t>
+      </w:r>
+      <w:r>
+        <w:t xml:space="preserve">with ordinal data.</w:t>
       </w:r>
       <w:r>
         <w:br/>
-      </w:r>
-      <w:r>
-        <w:rPr>
-          <w:rStyle w:val="VerbatimChar"/>
-        </w:rPr>
-        <w:t xml:space="preserve">2.  Symmetry-breaking conditions\</w:t>
-      </w:r>
-      <w:r>
-        <w:br/>
-      </w:r>
-      <w:r>
-        <w:rPr>
-          <w:rStyle w:val="VerbatimChar"/>
-        </w:rPr>
-        <w:t xml:space="preserve">3.  Empirical consequences $\leadsto$ hypo testing and significance</w:t>
-      </w:r>
-      <w:r>
-        <w:br/>
-      </w:r>
-      <w:r>
-        <w:rPr>
-          <w:rStyle w:val="VerbatimChar"/>
-        </w:rPr>
-        <w:t xml:space="preserve">4.  Supporting tools</w:t>
-      </w:r>
-    </w:p>
-    <w:bookmarkEnd w:id="21"/>
-    <w:bookmarkStart w:id="22" w:name="possible-literature"/>
-    <w:p>
-      <w:pPr>
-        <w:pStyle w:val="Heading2"/>
-      </w:pPr>
-      <w:r>
-        <w:t xml:space="preserve">1.3 Possible Literature</w:t>
-      </w:r>
-    </w:p>
-    <w:p>
-      <w:pPr>
-        <w:pStyle w:val="FirstParagraph"/>
-      </w:pPr>
-      <w:r>
-        <w:t xml:space="preserve">Cambanis et al. (1976)</w:t>
-      </w:r>
-    </w:p>
-    <w:p>
-      <w:pPr>
-        <w:pStyle w:val="BodyText"/>
-      </w:pPr>
-      <w:r>
-        <w:t xml:space="preserve">Shih &amp; Huang (1992)</w:t>
-      </w:r>
-    </w:p>
-    <w:p>
-      <w:pPr>
-        <w:pStyle w:val="BodyText"/>
-      </w:pPr>
-      <w:r>
-        <w:t xml:space="preserve">Grether, D. M. (1976). On the Use of Ordinal Data in Correlation Analysis. American Sociological Review, 41(5), 908–912. https://doi.org/10.2307/2094741</w:t>
-      </w:r>
-    </w:p>
-    <w:p>
-      <w:pPr>
-        <w:pStyle w:val="BodyText"/>
-      </w:pPr>
-      <w:r>
-        <w:t xml:space="preserve">Labovitz, S. (1967). Some observations on measurement and statistics. Social Forces, 46(2), 151–160. https://doi.org/10.2307/2574595</w:t>
-      </w:r>
-    </w:p>
-    <w:p>
-      <w:pPr>
-        <w:pStyle w:val="BodyText"/>
-      </w:pPr>
-      <w:r>
-        <w:t xml:space="preserve">Labovitz, S. (1970). The assignment of numbers to rank order categories. American Sociological Review, 35(3), 515–524. https://doi.org/10.2307/2092993</w:t>
-      </w:r>
-    </w:p>
-    <w:p>
-      <w:pPr>
-        <w:pStyle w:val="BodyText"/>
-      </w:pPr>
-      <w:r>
-        <w:t xml:space="preserve">Moss, J., &amp; Grønneberg, S. (2023). Partial Identification of Latent Correlations with Ordinal Data. Psychometrika, 88(1), 241–252. https://doi.org/10.1007/s11336-022-09898-y</w:t>
-      </w:r>
-    </w:p>
-    <w:p>
-      <w:pPr>
-        <w:pStyle w:val="BodyText"/>
-      </w:pPr>
-      <w:r>
-        <w:t xml:space="preserve">O’Brien, R. M. (1979). The use of Pearson’s r with ordinal data. American Sociological Review, 44(5), 851–857. https://doi.org/10.2307/2094532</w:t>
-      </w:r>
-    </w:p>
-    <w:p>
-      <w:pPr>
-        <w:pStyle w:val="BodyText"/>
-      </w:pPr>
-      <w:r>
-        <w:t xml:space="preserve">Robitzsch, A. (2022). On the Bias in Confirmatory Factor Analysis When Treating Discrete Variables as Ordinal Instead of Continuous. Axioms, 11(4), Article 4. https://doi.org/10.3390/axioms11040162</w:t>
-      </w:r>
-    </w:p>
-    <w:p>
-      <w:pPr>
-        <w:pStyle w:val="BodyText"/>
-      </w:pPr>
-      <w:r>
-        <w:t xml:space="preserve">Fréchet (1951)</w:t>
-      </w:r>
-    </w:p>
-    <w:p>
-      <w:pPr>
-        <w:pStyle w:val="BodyText"/>
-      </w:pPr>
-      <w:r>
-        <w:t xml:space="preserve">Whitt (1976)</w:t>
-      </w:r>
-    </w:p>
-    <w:p>
-      <w:pPr>
-        <w:pStyle w:val="BodyText"/>
-      </w:pPr>
-      <w:r>
-        <w:t xml:space="preserve">HOEFFDING (1940)</w:t>
-      </w:r>
-    </w:p>
-    <w:p>
-      <w:pPr>
-        <w:pStyle w:val="BodyText"/>
-      </w:pPr>
-      <w:r>
-        <w:t xml:space="preserve">Lehmann (1966)</w:t>
-      </w:r>
-    </w:p>
-    <w:p>
-      <w:pPr>
-        <w:pStyle w:val="BodyText"/>
-      </w:pPr>
-      <w:r>
-        <w:t xml:space="preserve">Tchen (1980)</w:t>
-      </w:r>
-    </w:p>
-    <w:bookmarkEnd w:id="22"/>
-    <w:bookmarkEnd w:id="23"/>
-    <w:bookmarkStart w:id="27" w:name="introduction-and-conceptual-setting"/>
-    <w:p>
-      <w:pPr>
-        <w:pStyle w:val="Heading1"/>
-      </w:pPr>
-      <w:r>
-        <w:t xml:space="preserve">2. Introduction and Conceptual Setting</w:t>
-      </w:r>
-    </w:p>
-    <w:p>
-      <w:pPr>
-        <w:pStyle w:val="FirstParagraph"/>
-      </w:pPr>
-      <w:r>
-        <w:t xml:space="preserve">In this article we elaborate why correlations involving ordered-categorical variables are generally</w:t>
-      </w:r>
-      <w:r>
-        <w:t xml:space="preserve"> </w:t>
-      </w:r>
-      <w:r>
-        <w:t xml:space="preserve">‘constrained’</w:t>
-      </w:r>
-      <w:r>
-        <w:t xml:space="preserve">, which means that their attainable maximum and minimum values are not +1 and -1, as is often thought, but between values that have to be calculated for each pair of variables.</w:t>
-      </w:r>
-      <w:r>
-        <w:t xml:space="preserve"> </w:t>
-      </w:r>
-      <w:r>
-        <w:t xml:space="preserve">We assess the magnitude of these constraints in fictitious as well as empirical data and analyse under which conditions they are most severe.</w:t>
-      </w:r>
-      <w:r>
-        <w:t xml:space="preserve"> </w:t>
-      </w:r>
-      <w:r>
-        <w:t xml:space="preserve">The article is accompanied by a software tool in</w:t>
-      </w:r>
-      <w:r>
-        <w:t xml:space="preserve"> </w:t>
-      </w:r>
-      <w:r>
-        <w:rPr>
-          <w:rStyle w:val="VerbatimChar"/>
-        </w:rPr>
-        <w:t xml:space="preserve">R:</w:t>
-      </w:r>
-      <w:r>
-        <w:t xml:space="preserve"> </w:t>
-      </w:r>
-      <w:r>
-        <w:t xml:space="preserve">that allows applied researchers to easily assess the extent of the problem in their own data.</w:t>
-      </w:r>
-      <w:r>
-        <w:t xml:space="preserve"> </w:t>
-      </w:r>
-      <w:r>
-        <w:t xml:space="preserve">The use of product-moment correlations (also known as Pearson correlations) to assess relationships between ordered-categorical variables –henceforth referred to as ordcats– is widespread and widely condoned in empirical studies, in spite of such variables not being metric while the product-moment correlation assumes that they are.</w:t>
-      </w:r>
-      <w:r>
-        <w:t xml:space="preserve"> </w:t>
-      </w:r>
-      <w:r>
-        <w:t xml:space="preserve">We do not focus on this problem from an obsessive desire for methodological purity, were it only because many statistical procedures are quite robust for violations of their assumptions [fn: examples?]</w:t>
-      </w:r>
-      <w:r>
-        <w:t xml:space="preserve"> </w:t>
-      </w:r>
-      <w:r>
-        <w:t xml:space="preserve">.</w:t>
-      </w:r>
-      <w:r>
-        <w:t xml:space="preserve"> </w:t>
-      </w:r>
-      <w:r>
-        <w:t xml:space="preserve">Instead, we draw attention to a problematic consequence of this violation of assumptions that, as far as we know, has been rarely recognised in the applied literature although it is well-known in the theoretical statistical literature.</w:t>
-      </w:r>
-      <w:r>
-        <w:t xml:space="preserve"> </w:t>
-      </w:r>
-      <w:r>
-        <w:t xml:space="preserve">This is the problem that correlation coefficients involving ordcats are constrained in their range which may make them mutually incomparable and may lead to further problems downstream the analytical process.</w:t>
-      </w:r>
-      <w:r>
-        <w:t xml:space="preserve"> </w:t>
-      </w:r>
-      <w:r>
-        <w:t xml:space="preserve">This article proceeds as follows.</w:t>
-      </w:r>
-      <w:r>
-        <w:t xml:space="preserve"> </w:t>
-      </w:r>
-      <w:r>
-        <w:t xml:space="preserve">We start by briefly elaborating the character of ordinal categorical variables (ordcats), why they are generally not regarded as being metric, and why, in spite of that, they are nevertheless very frequently used in statistical procedures that assume metric level data.</w:t>
-      </w:r>
-      <w:r>
-        <w:t xml:space="preserve"> </w:t>
-      </w:r>
-      <w:r>
-        <w:t xml:space="preserve">We then proceed to show why correlations based on ordcats tend to be constrained, which implies that their range is smaller than from -1 to +1, and why this is problematic in applied research.</w:t>
-      </w:r>
-      <w:r>
-        <w:t xml:space="preserve"> </w:t>
-      </w:r>
-      <w:r>
-        <w:t xml:space="preserve">This raises the question how to determine the actual range of correlations between ordcats, which we address in the subsequent section.</w:t>
-      </w:r>
-      <w:r>
-        <w:t xml:space="preserve"> </w:t>
-      </w:r>
-      <w:r>
-        <w:t xml:space="preserve">In section 5 we assess the magnitude of these constraining effects on 7503 correlations between 123 ordcats from a mass survey that typically gives rise ordered categorical variables (ordcats), the British Election Study.</w:t>
-      </w:r>
-      <w:r>
-        <w:t xml:space="preserve"> </w:t>
-      </w:r>
-      <w:r>
-        <w:t xml:space="preserve">We use the same data to explore conditions that influence the magnitude of the constraining effect.</w:t>
-      </w:r>
-    </w:p>
-    <w:p>
-      <w:pPr>
-        <w:pStyle w:val="BodyText"/>
-      </w:pPr>
-      <w:r>
-        <w:t xml:space="preserve">[Other sections in between?]</w:t>
-      </w:r>
-      <w:r>
-        <w:t xml:space="preserve"> </w:t>
-      </w:r>
-      <w:r>
-        <w:t xml:space="preserve">In the concluding section we discuss implications of our findings, suggestions for dealing with this problem for applied researchers, and directions for further research.</w:t>
-      </w:r>
-    </w:p>
-    <w:bookmarkStart w:id="24" w:name="Xf8c637a8862c6456edcdf58f03db81712d2713c"/>
-    <w:p>
-      <w:pPr>
-        <w:pStyle w:val="Heading2"/>
-      </w:pPr>
-      <w:r>
-        <w:t xml:space="preserve">2.1 On ordinal-categorical variables (ordcats), their level of measurement and their common use in quantitative analyses</w:t>
-      </w:r>
-    </w:p>
-    <w:p>
-      <w:pPr>
-        <w:pStyle w:val="FirstParagraph"/>
-      </w:pPr>
-      <w:r>
-        <w:t xml:space="preserve">Ordcats are ordinal variables with a relatively small number of categories (or ranks) compared to the number of cases, thus resulting in partial orderings of cases.</w:t>
-      </w:r>
-      <w:r>
-        <w:t xml:space="preserve"> </w:t>
-      </w:r>
-      <w:r>
-        <w:t xml:space="preserve">Although they can be found in all field of quantitative inquiry they are ubiquitous in data from standardised social science surveys.</w:t>
-      </w:r>
-      <w:r>
-        <w:t xml:space="preserve"> </w:t>
-      </w:r>
-      <w:r>
-        <w:t xml:space="preserve">Likert items and rating scales [describe in fn Likert items and rating scales, add that there are yet other formats such as semantic-differential scales that also yield ordcats] are among the most favoured ways to elicit responses in such surveys.</w:t>
-      </w:r>
-      <w:r>
-        <w:t xml:space="preserve"> </w:t>
-      </w:r>
-      <w:r>
-        <w:t xml:space="preserve">These survey-question formats have most often between 3 and 11 ordinal categories [fn (or not?) about ANES</w:t>
-      </w:r>
-      <w:r>
-        <w:t xml:space="preserve"> </w:t>
-      </w:r>
-      <w:r>
-        <w:t xml:space="preserve">‘feeling thermometer’</w:t>
-      </w:r>
-      <w:r>
-        <w:t xml:space="preserve"> </w:t>
-      </w:r>
-      <w:r>
-        <w:t xml:space="preserve">which has 101 categories but in view of the clustering of responses around only some values can perhaps better be regarded as a 13-point ordcat].</w:t>
-      </w:r>
-      <w:r>
-        <w:t xml:space="preserve"> </w:t>
-      </w:r>
-      <w:r>
-        <w:t xml:space="preserve">The numerical values used to distinguish the categories of ordcats are most often consecutive integers, starting with either 0 or 1, and in applied survey data analyses it is common to interpret these values as scores.</w:t>
-      </w:r>
-      <w:r>
-        <w:t xml:space="preserve"> </w:t>
-      </w:r>
-      <w:r>
-        <w:t xml:space="preserve">A frequently issued objection against this so-called equal-distance scoring practice [fn: add references] is that it implies that the difference in meaning between, e.g., categories 1 and 2 is equal to that between categories 3 and 4, etc., without clear justification.</w:t>
-      </w:r>
-      <w:r>
-        <w:t xml:space="preserve"> </w:t>
-      </w:r>
-      <w:r>
-        <w:t xml:space="preserve">In other words, it implies an interval-level interpretation by fiat.</w:t>
-      </w:r>
-      <w:r>
-        <w:t xml:space="preserve"> </w:t>
-      </w:r>
-      <w:r>
-        <w:t xml:space="preserve">[add fn: In principle it is quite possible to assign values to survey-based ordcats that have a clear empirical justification, for example by calibrating against psychophysical measurements (cf., Lodge; Tillie; others), or against the results of psychometric/linguistic analysis of verbal response labels (cf Sönning 2024).</w:t>
-      </w:r>
-      <w:r>
-        <w:t xml:space="preserve"> </w:t>
-      </w:r>
-      <w:r>
-        <w:t xml:space="preserve">However, such procedures are rarely integrated in applied survey research because of their high costs.] The consequence of this objection is that ordcats should be considered ordinal variables and that they should not be analysed with statistical procedures requiring metric data.</w:t>
-      </w:r>
-      <w:r>
-        <w:t xml:space="preserve"> </w:t>
-      </w:r>
-      <w:r>
-        <w:t xml:space="preserve">In spite of this objection we find that ordcats are very commonly analysed with product-moment correlations or with procedures that build upon such correlations.</w:t>
-      </w:r>
-      <w:r>
-        <w:t xml:space="preserve"> </w:t>
-      </w:r>
-      <w:r>
-        <w:t xml:space="preserve">We find this clearly exhibited in published articles in high-ranking academic journals [fn: explain how we did this] and in highly regarded textbooks where examples are given of the use of correlations between ordcats as input for procedures such as PCA, FA or SEM [fn: examples: Kline; Byrne; xxx].</w:t>
-      </w:r>
-      <w:r>
-        <w:t xml:space="preserve"> </w:t>
-      </w:r>
-      <w:r>
-        <w:t xml:space="preserve">This practice is so established that it is occasionally rationalised by referring to ordcats as being</w:t>
-      </w:r>
-      <w:r>
-        <w:t xml:space="preserve"> </w:t>
-      </w:r>
-      <w:r>
-        <w:t xml:space="preserve">‘quasi-interval level’</w:t>
-      </w:r>
-      <w:r>
-        <w:t xml:space="preserve"> </w:t>
-      </w:r>
-      <w:r>
-        <w:t xml:space="preserve">measures [fn: reference].</w:t>
-      </w:r>
-      <w:r>
-        <w:t xml:space="preserve"> </w:t>
-      </w:r>
-      <w:r>
-        <w:t xml:space="preserve">One can, however, also find some justifications in the literature for this practice, which emphasises the robustness of correlation coefficients for violations of variables involved .</w:t>
-      </w:r>
-      <w:r>
-        <w:t xml:space="preserve"> </w:t>
-      </w:r>
-      <w:r>
-        <w:t xml:space="preserve">Labovitz (1967, 1970) in particular has compared correlations between ordcats using the equal-scoring distance with a monotonic random scoring (a procedure that only assumes ordinality between categories).</w:t>
-      </w:r>
-      <w:r>
-        <w:t xml:space="preserve"> </w:t>
-      </w:r>
-      <w:r>
-        <w:t xml:space="preserve">He claims that the differences are negligible, which suggests that eve n if the theoretical objection against unfounded interval level interpretations of ordcats would be justified, that objection would nevertheless have such minor practical consequences as to make to irrelevant in most situations.</w:t>
-      </w:r>
-      <w:r>
-        <w:t xml:space="preserve"> </w:t>
-      </w:r>
-      <w:r>
-        <w:t xml:space="preserve">Not surprisingly, Labovitz’ work has, in turn be criticised itself on various grounds, most particularly of (inadvertently) mainly covering situations where this robustness holds, and not very well other situations (cf O’Brien 1979; xxx).</w:t>
-      </w:r>
-      <w:r>
-        <w:t xml:space="preserve"> </w:t>
-      </w:r>
-      <w:r>
-        <w:t xml:space="preserve">At this place we will not focus on discussions about the equal-distance scoring practice.</w:t>
-      </w:r>
-      <w:r>
-        <w:t xml:space="preserve"> </w:t>
-      </w:r>
-      <w:r>
-        <w:t xml:space="preserve">Our main reason for referring to it is to demonstrate the existence of lively debates in the applied literature about potential issues when using ordcats in procedures requiring metric data.</w:t>
-      </w:r>
-      <w:r>
-        <w:t xml:space="preserve"> </w:t>
-      </w:r>
-      <w:r>
-        <w:t xml:space="preserve">The existence of these debates makes it remarkable that another important issue has –to the best of our knowledge– remained mainly overlooked in the applied literature while it has been well-known in the theoretical statistical literature.</w:t>
-      </w:r>
-      <w:r>
-        <w:t xml:space="preserve"> </w:t>
-      </w:r>
-      <w:r>
-        <w:t xml:space="preserve">This is the problem that correlations between ordcats are generally</w:t>
-      </w:r>
-      <w:r>
-        <w:t xml:space="preserve"> </w:t>
-      </w:r>
-      <w:r>
-        <w:t xml:space="preserve">‘constrained’</w:t>
-      </w:r>
-      <w:r>
-        <w:t xml:space="preserve">, which means that they do not range between -1 and +1, but between minima and maxima that have to be calculated separately for each pair.</w:t>
-      </w:r>
-      <w:r>
-        <w:t xml:space="preserve"> </w:t>
-      </w:r>
-      <w:r>
-        <w:t xml:space="preserve">The nature of this issue is the subject of the next section.</w:t>
-      </w:r>
-    </w:p>
-    <w:bookmarkEnd w:id="24"/>
-    <w:bookmarkStart w:id="25" w:name="X0f68702390d6cd08ae85ac9307ee5ba90125ad6"/>
-    <w:p>
-      <w:pPr>
-        <w:pStyle w:val="Heading2"/>
-      </w:pPr>
-      <w:r>
-        <w:t xml:space="preserve">2.2 Ordinal categorical variables (ordcats) and</w:t>
-      </w:r>
-      <w:r>
-        <w:t xml:space="preserve"> </w:t>
-      </w:r>
-      <w:r>
-        <w:t xml:space="preserve">‘constrained’</w:t>
-      </w:r>
-      <w:r>
-        <w:t xml:space="preserve"> </w:t>
-      </w:r>
-      <w:r>
-        <w:t xml:space="preserve">correlations</w:t>
       </w:r>
     </w:p>
     <w:p>
@@ -1407,7 +1053,69 @@
         </w:numPr>
       </w:pPr>
       <w:r>
-        <w:t xml:space="preserve">Simple example of 4x4 crosstab</w:t>
+        <w:rPr>
+          <w:i/>
+          <w:iCs/>
+        </w:rPr>
+        <w:t xml:space="preserve">Alert</w:t>
+      </w:r>
+      <w:r>
+        <w:t xml:space="preserve"> </w:t>
+      </w:r>
+      <w:r>
+        <w:t xml:space="preserve">applied researachers of</w:t>
+      </w:r>
+      <w:r>
+        <w:t xml:space="preserve"> </w:t>
+      </w:r>
+      <w:r>
+        <w:t xml:space="preserve">‘elastic bounds’</w:t>
+      </w:r>
+    </w:p>
+    <w:p>
+      <w:pPr>
+        <w:pStyle w:val="Compact"/>
+        <w:numPr>
+          <w:ilvl w:val="1"/>
+          <w:numId w:val="1021"/>
+        </w:numPr>
+      </w:pPr>
+      <w:r>
+        <w:t xml:space="preserve">Problems of ignoring the above</w:t>
+      </w:r>
+      <w:r>
+        <w:t xml:space="preserve"> </w:t>
+      </w:r>
+      <m:oMath>
+        <m:r>
+          <m:rPr>
+            <m:sty m:val="p"/>
+          </m:rPr>
+          <m:t>⤳</m:t>
+        </m:r>
+      </m:oMath>
+      <w:r>
+        <w:t xml:space="preserve"> </w:t>
+      </w:r>
+      <w:r>
+        <w:t xml:space="preserve">errors in interpretation (e.g. Cohen and Cohen) – how max/min bounds of</w:t>
+      </w:r>
+      <w:r>
+        <w:t xml:space="preserve"> </w:t>
+      </w:r>
+      <m:oMath>
+        <m:r>
+          <m:t>r</m:t>
+        </m:r>
+      </m:oMath>
+      <w:r>
+        <w:t xml:space="preserve"> </w:t>
+      </w:r>
+      <w:r>
+        <w:t xml:space="preserve">vary with marginals.</w:t>
+      </w:r>
+      <w:r>
+        <w:br/>
       </w:r>
     </w:p>
     <w:p>
@@ -1419,7 +1127,17 @@
         </w:numPr>
       </w:pPr>
       <w:r>
-        <w:t xml:space="preserve">Conclusion: for every given distribution of a variable, there are only two distributions of the other variable which do not constrain r: the same, and the inverse. Every other distribution does constrain r</w:t>
+        <w:rPr>
+          <w:i/>
+          <w:iCs/>
+        </w:rPr>
+        <w:t xml:space="preserve">Provide</w:t>
+      </w:r>
+      <w:r>
+        <w:t xml:space="preserve"> </w:t>
+      </w:r>
+      <w:r>
+        <w:t xml:space="preserve">tools to assess if problems exist in own data/ research</w:t>
       </w:r>
     </w:p>
     <w:p>
@@ -1431,53 +1149,65 @@
         </w:numPr>
       </w:pPr>
       <w:r>
-        <w:t xml:space="preserve">In case of constrainment (</w:t>
-      </w:r>
-      <w:r>
-        <w:t xml:space="preserve">‘shrinkage’</w:t>
-      </w:r>
-      <w:r>
-        <w:t xml:space="preserve">?), the relationship becomes partially nonlinear, by necessity (does this means that the problem of constrainment does not exist for eta?) Is there a measure for nonlinearity? (polynomial multiple correlation?)</w:t>
-      </w:r>
-    </w:p>
-    <w:p>
-      <w:pPr>
-        <w:pStyle w:val="FirstParagraph"/>
-      </w:pPr>
-      <w:r>
-        <w:t xml:space="preserve">Determining the minimum and maximum attainable values of r for given marginal distributions</w:t>
-      </w:r>
-    </w:p>
-    <w:p>
-      <w:pPr>
-        <w:pStyle w:val="Compact"/>
-        <w:numPr>
-          <w:ilvl w:val="0"/>
-          <w:numId w:val="1021"/>
-        </w:numPr>
-      </w:pPr>
-      <w:r>
-        <w:t xml:space="preserve">Explain different strategies which will all yield the same answers: separate sorting and pairing / Frechet-Hoeffding bounds/ etc</w:t>
-      </w:r>
-    </w:p>
-    <w:p>
-      <w:pPr>
-        <w:pStyle w:val="Compact"/>
-        <w:numPr>
-          <w:ilvl w:val="0"/>
-          <w:numId w:val="1021"/>
-        </w:numPr>
-      </w:pPr>
-      <w:r>
-        <w:t xml:space="preserve">Proofs in appendix?</w:t>
-      </w:r>
-    </w:p>
-    <w:p>
-      <w:pPr>
-        <w:pStyle w:val="FirstParagraph"/>
-      </w:pPr>
-      <w:r>
-        <w:t xml:space="preserve">How severely are correlations constrained – or: how long is a piece of string?</w:t>
+        <w:rPr>
+          <w:i/>
+          <w:iCs/>
+        </w:rPr>
+        <w:t xml:space="preserve">Clarify</w:t>
+      </w:r>
+      <w:r>
+        <w:t xml:space="preserve"> </w:t>
+      </w:r>
+      <w:r>
+        <w:t xml:space="preserve">that traditional hypothesis testing (e.g. t-test of</w:t>
+      </w:r>
+      <w:r>
+        <w:t xml:space="preserve"> </w:t>
+      </w:r>
+      <m:oMath>
+        <m:sSub>
+          <m:e>
+            <m:r>
+              <m:t>H</m:t>
+            </m:r>
+          </m:e>
+          <m:sub>
+            <m:r>
+              <m:t>0</m:t>
+            </m:r>
+          </m:sub>
+        </m:sSub>
+        <m:r>
+          <m:rPr>
+            <m:sty m:val="p"/>
+          </m:rPr>
+          <m:t>:</m:t>
+        </m:r>
+        <m:r>
+          <m:t>r</m:t>
+        </m:r>
+        <m:r>
+          <m:rPr>
+            <m:sty m:val="p"/>
+          </m:rPr>
+          <m:t>=</m:t>
+        </m:r>
+        <m:r>
+          <m:t>0</m:t>
+        </m:r>
+      </m:oMath>
+      <w:r>
+        <w:t xml:space="preserve">) are incorrect and provide correct hypo testing (permutation/ randomization tests)</w:t>
+      </w:r>
+    </w:p>
+    <w:bookmarkEnd w:id="21"/>
+    <w:bookmarkStart w:id="22" w:name="contributions"/>
+    <w:p>
+      <w:pPr>
+        <w:pStyle w:val="Heading2"/>
+      </w:pPr>
+      <w:r>
+        <w:t xml:space="preserve">2.2 Contributions:</w:t>
       </w:r>
     </w:p>
     <w:p>
@@ -1489,7 +1219,10 @@
         </w:numPr>
       </w:pPr>
       <w:r>
-        <w:t xml:space="preserve">Explain strategy of using BES data and resulting dataset of 7503 item-pairs</w:t>
+        <w:t xml:space="preserve">Theory of optimal bounds</w:t>
+      </w:r>
+      <w:r>
+        <w:br/>
       </w:r>
     </w:p>
     <w:p>
@@ -1501,37 +1234,539 @@
         </w:numPr>
       </w:pPr>
       <w:r>
-        <w:t xml:space="preserve">Descriptive analyses:</w:t>
+        <w:t xml:space="preserve">Symmetry-breaking conditions</w:t>
+      </w:r>
+      <w:r>
+        <w:br/>
       </w:r>
     </w:p>
     <w:p>
       <w:pPr>
         <w:pStyle w:val="Compact"/>
         <w:numPr>
-          <w:ilvl w:val="1"/>
+          <w:ilvl w:val="0"/>
+          <w:numId w:val="1022"/>
+        </w:numPr>
+      </w:pPr>
+      <w:r>
+        <w:t xml:space="preserve">Empirical consequences</w:t>
+      </w:r>
+      <w:r>
+        <w:t xml:space="preserve"> </w:t>
+      </w:r>
+      <m:oMath>
+        <m:r>
+          <m:rPr>
+            <m:sty m:val="p"/>
+          </m:rPr>
+          <m:t>⤳</m:t>
+        </m:r>
+      </m:oMath>
+      <w:r>
+        <w:t xml:space="preserve"> </w:t>
+      </w:r>
+      <w:r>
+        <w:t xml:space="preserve">hypo testing and significance</w:t>
+      </w:r>
+    </w:p>
+    <w:p>
+      <w:pPr>
+        <w:pStyle w:val="Compact"/>
+        <w:numPr>
+          <w:ilvl w:val="0"/>
+          <w:numId w:val="1022"/>
+        </w:numPr>
+      </w:pPr>
+      <w:r>
+        <w:t xml:space="preserve">Supporting tools</w:t>
+      </w:r>
+    </w:p>
+    <w:bookmarkEnd w:id="22"/>
+    <w:bookmarkStart w:id="23" w:name="possible-literature"/>
+    <w:p>
+      <w:pPr>
+        <w:pStyle w:val="Heading2"/>
+      </w:pPr>
+      <w:r>
+        <w:t xml:space="preserve">2.3 Possible Literature</w:t>
+      </w:r>
+    </w:p>
+    <w:p>
+      <w:pPr>
+        <w:pStyle w:val="FirstParagraph"/>
+      </w:pPr>
+      <w:r>
+        <w:t xml:space="preserve">Cambanis et al. (1976)</w:t>
+      </w:r>
+    </w:p>
+    <w:p>
+      <w:pPr>
+        <w:pStyle w:val="BodyText"/>
+      </w:pPr>
+      <w:r>
+        <w:t xml:space="preserve">Shih &amp; Huang (1992)</w:t>
+      </w:r>
+    </w:p>
+    <w:p>
+      <w:pPr>
+        <w:pStyle w:val="BodyText"/>
+      </w:pPr>
+      <w:r>
+        <w:t xml:space="preserve">Grether, D. M. (1976). On the Use of Ordinal Data in Correlation Analysis. American Sociological Review, 41(5), 908–912. https://doi.org/10.2307/2094741</w:t>
+      </w:r>
+    </w:p>
+    <w:p>
+      <w:pPr>
+        <w:pStyle w:val="BodyText"/>
+      </w:pPr>
+      <w:r>
+        <w:t xml:space="preserve">Labovitz, S. (1967). Some observations on measurement and statistics. Social Forces, 46(2), 151–160. https://doi.org/10.2307/2574595</w:t>
+      </w:r>
+    </w:p>
+    <w:p>
+      <w:pPr>
+        <w:pStyle w:val="BodyText"/>
+      </w:pPr>
+      <w:r>
+        <w:t xml:space="preserve">Labovitz, S. (1970). The assignment of numbers to rank order categories. American Sociological Review, 35(3), 515–524. https://doi.org/10.2307/2092993</w:t>
+      </w:r>
+    </w:p>
+    <w:p>
+      <w:pPr>
+        <w:pStyle w:val="BodyText"/>
+      </w:pPr>
+      <w:r>
+        <w:t xml:space="preserve">Moss, J., &amp; Grønneberg, S. (2023). Partial Identification of Latent Correlations with Ordinal Data. Psychometrika, 88(1), 241–252. https://doi.org/10.1007/s11336-022-09898-y</w:t>
+      </w:r>
+    </w:p>
+    <w:p>
+      <w:pPr>
+        <w:pStyle w:val="BodyText"/>
+      </w:pPr>
+      <w:r>
+        <w:t xml:space="preserve">O’Brien, R. M. (1979). The use of Pearson’s r with ordinal data. American Sociological Review, 44(5), 851–857. https://doi.org/10.2307/2094532</w:t>
+      </w:r>
+    </w:p>
+    <w:p>
+      <w:pPr>
+        <w:pStyle w:val="BodyText"/>
+      </w:pPr>
+      <w:r>
+        <w:t xml:space="preserve">Robitzsch, A. (2022). On the Bias in Confirmatory Factor Analysis When Treating Discrete Variables as Ordinal Instead of Continuous. Axioms, 11(4), Article 4. https://doi.org/10.3390/axioms11040162</w:t>
+      </w:r>
+    </w:p>
+    <w:p>
+      <w:pPr>
+        <w:pStyle w:val="BodyText"/>
+      </w:pPr>
+      <w:r>
+        <w:t xml:space="preserve">Fréchet (1951)</w:t>
+      </w:r>
+    </w:p>
+    <w:p>
+      <w:pPr>
+        <w:pStyle w:val="BodyText"/>
+      </w:pPr>
+      <w:r>
+        <w:t xml:space="preserve">Whitt (1976)</w:t>
+      </w:r>
+    </w:p>
+    <w:p>
+      <w:pPr>
+        <w:pStyle w:val="BodyText"/>
+      </w:pPr>
+      <w:r>
+        <w:t xml:space="preserve">Hoeffding (1940)</w:t>
+      </w:r>
+    </w:p>
+    <w:p>
+      <w:pPr>
+        <w:pStyle w:val="BodyText"/>
+      </w:pPr>
+      <w:r>
+        <w:t xml:space="preserve">Lehmann (1966)</w:t>
+      </w:r>
+    </w:p>
+    <w:p>
+      <w:pPr>
+        <w:pStyle w:val="BodyText"/>
+      </w:pPr>
+      <w:r>
+        <w:t xml:space="preserve">Tchen (1980)</w:t>
+      </w:r>
+    </w:p>
+    <w:p>
+      <w:r>
+        <w:br w:type="page"/>
+      </w:r>
+    </w:p>
+    <w:bookmarkEnd w:id="23"/>
+    <w:bookmarkEnd w:id="24"/>
+    <w:bookmarkStart w:id="28" w:name="introduction-and-conceptual-setting"/>
+    <w:p>
+      <w:pPr>
+        <w:pStyle w:val="Heading1"/>
+      </w:pPr>
+      <w:r>
+        <w:t xml:space="preserve">3. Introduction and Conceptual Setting</w:t>
+      </w:r>
+    </w:p>
+    <w:p>
+      <w:pPr>
+        <w:pStyle w:val="FirstParagraph"/>
+      </w:pPr>
+      <w:r>
+        <w:t xml:space="preserve">In this article we elaborate why correlations involving ordered-categorical variables are generally</w:t>
+      </w:r>
+      <w:r>
+        <w:t xml:space="preserve"> </w:t>
+      </w:r>
+      <w:r>
+        <w:t xml:space="preserve">‘constrained’</w:t>
+      </w:r>
+      <w:r>
+        <w:t xml:space="preserve">, which means that their attainable maximum and minimum values are not +1 and -1, as is often thought, but between values that have to be calculated for each pair of variables.</w:t>
+      </w:r>
+      <w:r>
+        <w:t xml:space="preserve"> </w:t>
+      </w:r>
+      <w:r>
+        <w:t xml:space="preserve">We assess the magnitude of these constraints in fictitious as well as empirical data and analyse under which conditions they are most severe.</w:t>
+      </w:r>
+      <w:r>
+        <w:t xml:space="preserve"> </w:t>
+      </w:r>
+      <w:r>
+        <w:t xml:space="preserve">The article is accompanied by a software tool in</w:t>
+      </w:r>
+      <w:r>
+        <w:t xml:space="preserve"> </w:t>
+      </w:r>
+      <w:r>
+        <w:rPr>
+          <w:rStyle w:val="VerbatimChar"/>
+        </w:rPr>
+        <w:t xml:space="preserve">R:</w:t>
+      </w:r>
+      <w:r>
+        <w:t xml:space="preserve"> </w:t>
+      </w:r>
+      <w:r>
+        <w:t xml:space="preserve">that allows applied researchers to easily assess the extent of the problem in their own data.</w:t>
+      </w:r>
+      <w:r>
+        <w:t xml:space="preserve"> </w:t>
+      </w:r>
+      <w:r>
+        <w:t xml:space="preserve">The use of product-moment correlations (also known as Pearson correlations) to assess relationships between ordered-categorical variables –henceforth referred to as ordcats– is widespread and widely condoned in empirical studies, in spite of such variables not being metric while the product-moment correlation assumes that they are.</w:t>
+      </w:r>
+      <w:r>
+        <w:t xml:space="preserve"> </w:t>
+      </w:r>
+      <w:r>
+        <w:t xml:space="preserve">We do not focus on this problem from an obsessive desire for methodological purity, were it only because many statistical procedures are quite robust for violations of their assumptions [fn: examples?]</w:t>
+      </w:r>
+      <w:r>
+        <w:t xml:space="preserve"> </w:t>
+      </w:r>
+      <w:r>
+        <w:t xml:space="preserve">.</w:t>
+      </w:r>
+      <w:r>
+        <w:t xml:space="preserve"> </w:t>
+      </w:r>
+      <w:r>
+        <w:t xml:space="preserve">Instead, we draw attention to a problematic consequence of this violation of assumptions that, as far as we know, has been rarely recognised in the applied literature although it is well-known in the theoretical statistical literature.</w:t>
+      </w:r>
+      <w:r>
+        <w:t xml:space="preserve"> </w:t>
+      </w:r>
+      <w:r>
+        <w:t xml:space="preserve">This is the problem that correlation coefficients involving ordcats are constrained in their range which may make them mutually incomparable and may lead to further problems downstream the analytical process.</w:t>
+      </w:r>
+      <w:r>
+        <w:t xml:space="preserve"> </w:t>
+      </w:r>
+      <w:r>
+        <w:t xml:space="preserve">This article proceeds as follows.</w:t>
+      </w:r>
+      <w:r>
+        <w:t xml:space="preserve"> </w:t>
+      </w:r>
+      <w:r>
+        <w:t xml:space="preserve">We start by briefly elaborating the character of ordinal categorical variables (ordcats), why they are generally not regarded as being metric, and why, in spite of that, they are nevertheless very frequently used in statistical procedures that assume metric level data.</w:t>
+      </w:r>
+      <w:r>
+        <w:t xml:space="preserve"> </w:t>
+      </w:r>
+      <w:r>
+        <w:t xml:space="preserve">We then proceed to show why correlations based on ordcats tend to be constrained, which implies that their range is smaller than from -1 to +1, and why this is problematic in applied research.</w:t>
+      </w:r>
+      <w:r>
+        <w:t xml:space="preserve"> </w:t>
+      </w:r>
+      <w:r>
+        <w:t xml:space="preserve">This raises the question how to determine the actual range of correlations between ordcats, which we address in the subsequent section.</w:t>
+      </w:r>
+      <w:r>
+        <w:t xml:space="preserve"> </w:t>
+      </w:r>
+      <w:r>
+        <w:t xml:space="preserve">In section 5 we assess the magnitude of these constraining effects on 7503 correlations between 123 ordcats from a mass survey that typically gives rise ordered categorical variables (ordcats), the British Election Study.</w:t>
+      </w:r>
+      <w:r>
+        <w:t xml:space="preserve"> </w:t>
+      </w:r>
+      <w:r>
+        <w:t xml:space="preserve">We use the same data to explore conditions that influence the magnitude of the constraining effect.</w:t>
+      </w:r>
+    </w:p>
+    <w:p>
+      <w:pPr>
+        <w:pStyle w:val="BodyText"/>
+      </w:pPr>
+      <w:r>
+        <w:t xml:space="preserve">[Other sections in between?]</w:t>
+      </w:r>
+      <w:r>
+        <w:t xml:space="preserve"> </w:t>
+      </w:r>
+      <w:r>
+        <w:t xml:space="preserve">In the concluding section we discuss implications of our findings, suggestions for dealing with this problem for applied researchers, and directions for further research.</w:t>
+      </w:r>
+    </w:p>
+    <w:bookmarkStart w:id="25" w:name="Xf8c637a8862c6456edcdf58f03db81712d2713c"/>
+    <w:p>
+      <w:pPr>
+        <w:pStyle w:val="Heading2"/>
+      </w:pPr>
+      <w:r>
+        <w:t xml:space="preserve">3.1 On ordinal-categorical variables (ordcats), their level of measurement and their common use in quantitative analyses</w:t>
+      </w:r>
+    </w:p>
+    <w:p>
+      <w:pPr>
+        <w:pStyle w:val="FirstParagraph"/>
+      </w:pPr>
+      <w:r>
+        <w:t xml:space="preserve">Ordcats are ordinal variables with a relatively small number of categories (or ranks) compared to the number of cases, thus resulting in partial orderings of cases.</w:t>
+      </w:r>
+      <w:r>
+        <w:t xml:space="preserve"> </w:t>
+      </w:r>
+      <w:r>
+        <w:t xml:space="preserve">Although they can be found in all field of quantitative inquiry they are ubiquitous in data from standardised social science surveys.</w:t>
+      </w:r>
+      <w:r>
+        <w:t xml:space="preserve"> </w:t>
+      </w:r>
+      <w:r>
+        <w:t xml:space="preserve">Likert items and rating scales [describe in fn Likert items and rating scales, add that there are yet other formats such as semantic-differential scales that also yield ordcats] are among the most favoured ways to elicit responses in such surveys.</w:t>
+      </w:r>
+      <w:r>
+        <w:t xml:space="preserve"> </w:t>
+      </w:r>
+      <w:r>
+        <w:t xml:space="preserve">These survey-question formats have most often between 3 and 11 ordinal categories [fn (or not?) about ANES</w:t>
+      </w:r>
+      <w:r>
+        <w:t xml:space="preserve"> </w:t>
+      </w:r>
+      <w:r>
+        <w:t xml:space="preserve">‘feeling thermometer’</w:t>
+      </w:r>
+      <w:r>
+        <w:t xml:space="preserve"> </w:t>
+      </w:r>
+      <w:r>
+        <w:t xml:space="preserve">which has 101 categories but in view of the clustering of responses around only some values can perhaps better be regarded as a 13-point ordcat].</w:t>
+      </w:r>
+      <w:r>
+        <w:t xml:space="preserve"> </w:t>
+      </w:r>
+      <w:r>
+        <w:t xml:space="preserve">The numerical values used to distinguish the categories of ordcats are most often consecutive integers, starting with either 0 or 1, and in applied survey data analyses it is common to interpret these values as scores.</w:t>
+      </w:r>
+      <w:r>
+        <w:t xml:space="preserve"> </w:t>
+      </w:r>
+      <w:r>
+        <w:t xml:space="preserve">A frequently issued objection against this so-called equal-distance scoring practice [fn: add references] is that it implies that the difference in meaning between, e.g., categories 1 and 2 is equal to that between categories 3 and 4, etc., without clear justification.</w:t>
+      </w:r>
+      <w:r>
+        <w:t xml:space="preserve"> </w:t>
+      </w:r>
+      <w:r>
+        <w:t xml:space="preserve">In other words, it implies an interval-level interpretation by fiat.</w:t>
+      </w:r>
+      <w:r>
+        <w:t xml:space="preserve"> </w:t>
+      </w:r>
+      <w:r>
+        <w:t xml:space="preserve">[add fn: In principle it is quite possible to assign values to survey-based ordcats that have a clear empirical justification, for example by calibrating against psychophysical measurements (cf., Lodge; Tillie; others), or against the results of psychometric/linguistic analysis of verbal response labels (cf Sönning 2024).</w:t>
+      </w:r>
+      <w:r>
+        <w:t xml:space="preserve"> </w:t>
+      </w:r>
+      <w:r>
+        <w:t xml:space="preserve">However, such procedures are rarely integrated in applied survey research because of their high costs.] The consequence of this objection is that ordcats should be considered ordinal variables and that they should not be analysed with statistical procedures requiring metric data.</w:t>
+      </w:r>
+      <w:r>
+        <w:t xml:space="preserve"> </w:t>
+      </w:r>
+      <w:r>
+        <w:t xml:space="preserve">In spite of this objection we find that ordcats are very commonly analysed with product-moment correlations or with procedures that build upon such correlations.</w:t>
+      </w:r>
+      <w:r>
+        <w:t xml:space="preserve"> </w:t>
+      </w:r>
+      <w:r>
+        <w:t xml:space="preserve">We find this clearly exhibited in published articles in high-ranking academic journals [fn: explain how we did this] and in highly regarded textbooks where examples are given of the use of correlations between ordcats as input for procedures such as PCA, FA or SEM [fn: examples: Kline; Byrne; xxx].</w:t>
+      </w:r>
+      <w:r>
+        <w:t xml:space="preserve"> </w:t>
+      </w:r>
+      <w:r>
+        <w:t xml:space="preserve">This practice is so established that it is occasionally rationalised by referring to ordcats as being</w:t>
+      </w:r>
+      <w:r>
+        <w:t xml:space="preserve"> </w:t>
+      </w:r>
+      <w:r>
+        <w:t xml:space="preserve">‘quasi-interval level’</w:t>
+      </w:r>
+      <w:r>
+        <w:t xml:space="preserve"> </w:t>
+      </w:r>
+      <w:r>
+        <w:t xml:space="preserve">measures [fn: reference].</w:t>
+      </w:r>
+      <w:r>
+        <w:t xml:space="preserve"> </w:t>
+      </w:r>
+      <w:r>
+        <w:t xml:space="preserve">One can, however, also find some justifications in the literature for this practice, which emphasises the robustness of correlation coefficients for violations of variables involved .</w:t>
+      </w:r>
+      <w:r>
+        <w:t xml:space="preserve"> </w:t>
+      </w:r>
+      <w:r>
+        <w:t xml:space="preserve">Labovitz (1967, 1970) in particular has compared correlations between ordcats using the equal-scoring distance with a monotonic random scoring (a procedure that only assumes ordinality between categories).</w:t>
+      </w:r>
+      <w:r>
+        <w:t xml:space="preserve"> </w:t>
+      </w:r>
+      <w:r>
+        <w:t xml:space="preserve">He claims that the differences are negligible, which suggests that eve n if the theoretical objection against unfounded interval level interpretations of ordcats would be justified, that objection would nevertheless have such minor practical consequences as to make to irrelevant in most situations.</w:t>
+      </w:r>
+      <w:r>
+        <w:t xml:space="preserve"> </w:t>
+      </w:r>
+      <w:r>
+        <w:t xml:space="preserve">Not surprisingly, Labovitz’ work has, in turn be criticised itself on various grounds, most particularly of (inadvertently) mainly covering situations where this robustness holds, and not very well other situations (cf O’Brien 1979; xxx).</w:t>
+      </w:r>
+      <w:r>
+        <w:t xml:space="preserve"> </w:t>
+      </w:r>
+      <w:r>
+        <w:t xml:space="preserve">At this place we will not focus on discussions about the equal-distance scoring practice.</w:t>
+      </w:r>
+      <w:r>
+        <w:t xml:space="preserve"> </w:t>
+      </w:r>
+      <w:r>
+        <w:t xml:space="preserve">Our main reason for referring to it is to demonstrate the existence of lively debates in the applied literature about potential issues when using ordcats in procedures requiring metric data.</w:t>
+      </w:r>
+      <w:r>
+        <w:t xml:space="preserve"> </w:t>
+      </w:r>
+      <w:r>
+        <w:t xml:space="preserve">The existence of these debates makes it remarkable that another important issue has –to the best of our knowledge– remained mainly overlooked in the applied literature while it has been well-known in the theoretical statistical literature.</w:t>
+      </w:r>
+      <w:r>
+        <w:t xml:space="preserve"> </w:t>
+      </w:r>
+      <w:r>
+        <w:t xml:space="preserve">This is the problem that correlations between ordcats are generally</w:t>
+      </w:r>
+      <w:r>
+        <w:t xml:space="preserve"> </w:t>
+      </w:r>
+      <w:r>
+        <w:t xml:space="preserve">‘constrained’</w:t>
+      </w:r>
+      <w:r>
+        <w:t xml:space="preserve">, which means that they do not range between -1 and +1, but between minima and maxima that have to be calculated separately for each pair.</w:t>
+      </w:r>
+      <w:r>
+        <w:t xml:space="preserve"> </w:t>
+      </w:r>
+      <w:r>
+        <w:t xml:space="preserve">The nature of this issue is the subject of the next section.</w:t>
+      </w:r>
+    </w:p>
+    <w:bookmarkEnd w:id="25"/>
+    <w:bookmarkStart w:id="26" w:name="X0f68702390d6cd08ae85ac9307ee5ba90125ad6"/>
+    <w:p>
+      <w:pPr>
+        <w:pStyle w:val="Heading2"/>
+      </w:pPr>
+      <w:r>
+        <w:t xml:space="preserve">3.2 Ordinal categorical variables (ordcats) and</w:t>
+      </w:r>
+      <w:r>
+        <w:t xml:space="preserve"> </w:t>
+      </w:r>
+      <w:r>
+        <w:t xml:space="preserve">‘constrained’</w:t>
+      </w:r>
+      <w:r>
+        <w:t xml:space="preserve"> </w:t>
+      </w:r>
+      <w:r>
+        <w:t xml:space="preserve">correlations</w:t>
+      </w:r>
+    </w:p>
+    <w:p>
+      <w:pPr>
+        <w:pStyle w:val="Compact"/>
+        <w:numPr>
+          <w:ilvl w:val="0"/>
           <w:numId w:val="1023"/>
         </w:numPr>
       </w:pPr>
       <w:r>
-        <w:t xml:space="preserve">Define a measure for extent of constrainment</w:t>
+        <w:t xml:space="preserve">Simple example of 4x4 crosstab</w:t>
       </w:r>
     </w:p>
     <w:p>
       <w:pPr>
         <w:pStyle w:val="Compact"/>
         <w:numPr>
-          <w:ilvl w:val="1"/>
+          <w:ilvl w:val="0"/>
           <w:numId w:val="1023"/>
         </w:numPr>
       </w:pPr>
       <w:r>
-        <w:t xml:space="preserve">Describe univariate distribution of this measure; asymmetry etc.</w:t>
-      </w:r>
-      <w:r>
-        <w:t xml:space="preserve"> </w:t>
-      </w:r>
-      <w:r>
-        <w:t xml:space="preserve">-Probability of reaching the r-max and r-min (and implications: does this mean that the constrainment is even more severe?)</w:t>
+        <w:t xml:space="preserve">Conclusion: for every given distribution of a variable, there are only two distributions of the other variable which do not constrain r: the same, and the inverse. Every other distribution does constrain r</w:t>
+      </w:r>
+    </w:p>
+    <w:p>
+      <w:pPr>
+        <w:pStyle w:val="Compact"/>
+        <w:numPr>
+          <w:ilvl w:val="0"/>
+          <w:numId w:val="1023"/>
+        </w:numPr>
+      </w:pPr>
+      <w:r>
+        <w:t xml:space="preserve">In case of constrainment (</w:t>
+      </w:r>
+      <w:r>
+        <w:t xml:space="preserve">‘shrinkage’</w:t>
+      </w:r>
+      <w:r>
+        <w:t xml:space="preserve">?), the relationship becomes partially nonlinear, by necessity (does this means that the problem of constrainment does not exist for eta?) Is there a measure for nonlinearity? (polynomial multiple correlation?)</w:t>
       </w:r>
     </w:p>
     <w:p>
@@ -1539,7 +1774,7 @@
         <w:pStyle w:val="FirstParagraph"/>
       </w:pPr>
       <w:r>
-        <w:t xml:space="preserve">Factors influencing the degree to which correlations are constrained</w:t>
+        <w:t xml:space="preserve">Determining the minimum and maximum attainable values of r for given marginal distributions</w:t>
       </w:r>
     </w:p>
     <w:p>
@@ -1551,7 +1786,7 @@
         </w:numPr>
       </w:pPr>
       <w:r>
-        <w:t xml:space="preserve">Analyses of the same dataset of 7503 item pairs</w:t>
+        <w:t xml:space="preserve">Explain different strategies which will all yield the same answers: separate sorting and pairing / Frechet-Hoeffding bounds/ etc</w:t>
       </w:r>
     </w:p>
     <w:p>
@@ -1563,7 +1798,39 @@
         </w:numPr>
       </w:pPr>
       <w:r>
-        <w:t xml:space="preserve">Other characteristics of these include</w:t>
+        <w:t xml:space="preserve">Proofs in appendix?</w:t>
+      </w:r>
+    </w:p>
+    <w:p>
+      <w:pPr>
+        <w:pStyle w:val="FirstParagraph"/>
+      </w:pPr>
+      <w:r>
+        <w:t xml:space="preserve">How severely are correlations constrained – or: how long is a piece of string?</w:t>
+      </w:r>
+    </w:p>
+    <w:p>
+      <w:pPr>
+        <w:pStyle w:val="Compact"/>
+        <w:numPr>
+          <w:ilvl w:val="0"/>
+          <w:numId w:val="1025"/>
+        </w:numPr>
+      </w:pPr>
+      <w:r>
+        <w:t xml:space="preserve">Explain strategy of using BES data and resulting dataset of 7503 item-pairs</w:t>
+      </w:r>
+    </w:p>
+    <w:p>
+      <w:pPr>
+        <w:pStyle w:val="Compact"/>
+        <w:numPr>
+          <w:ilvl w:val="0"/>
+          <w:numId w:val="1025"/>
+        </w:numPr>
+      </w:pPr>
+      <w:r>
+        <w:t xml:space="preserve">Descriptive analyses:</w:t>
       </w:r>
     </w:p>
     <w:p>
@@ -1571,11 +1838,11 @@
         <w:pStyle w:val="Compact"/>
         <w:numPr>
           <w:ilvl w:val="1"/>
-          <w:numId w:val="1025"/>
+          <w:numId w:val="1026"/>
         </w:numPr>
       </w:pPr>
       <w:r>
-        <w:t xml:space="preserve">Characteristics of each of the two vars separately (their variance / skew / kurtosis / mean etc), as well as dyadic characteristics (difference of means / skew/ etc)</w:t>
+        <w:t xml:space="preserve">Define a measure for extent of constrainment</w:t>
       </w:r>
     </w:p>
     <w:p>
@@ -1583,35 +1850,17 @@
         <w:pStyle w:val="Compact"/>
         <w:numPr>
           <w:ilvl w:val="1"/>
-          <w:numId w:val="1025"/>
-        </w:numPr>
-      </w:pPr>
-      <w:r>
-        <w:t xml:space="preserve">Hypotheses/expectations:</w:t>
-      </w:r>
-    </w:p>
-    <w:p>
-      <w:pPr>
-        <w:pStyle w:val="Compact"/>
-        <w:numPr>
-          <w:ilvl w:val="2"/>
           <w:numId w:val="1026"/>
         </w:numPr>
       </w:pPr>
       <w:r>
-        <w:t xml:space="preserve">Effect of difference of means and of difference of skew</w:t>
-      </w:r>
-    </w:p>
-    <w:p>
-      <w:pPr>
-        <w:pStyle w:val="Compact"/>
-        <w:numPr>
-          <w:ilvl w:val="2"/>
-          <w:numId w:val="1026"/>
-        </w:numPr>
-      </w:pPr>
-      <w:r>
-        <w:t xml:space="preserve">Perhaps effect of number of categories (constrainment less severe the larger the number of categories)</w:t>
+        <w:t xml:space="preserve">Describe univariate distribution of this measure; asymmetry etc.</w:t>
+      </w:r>
+      <w:r>
+        <w:t xml:space="preserve"> </w:t>
+      </w:r>
+      <w:r>
+        <w:t xml:space="preserve">-Probability of reaching the r-max and r-min (and implications: does this mean that the constrainment is even more severe?)</w:t>
       </w:r>
     </w:p>
     <w:p>
@@ -1619,7 +1868,7 @@
         <w:pStyle w:val="FirstParagraph"/>
       </w:pPr>
       <w:r>
-        <w:t xml:space="preserve">Consequences of constrained correlations in applied research</w:t>
+        <w:t xml:space="preserve">Factors influencing the degree to which correlations are constrained</w:t>
       </w:r>
     </w:p>
     <w:p>
@@ -1631,7 +1880,7 @@
         </w:numPr>
       </w:pPr>
       <w:r>
-        <w:t xml:space="preserve">Descriptive interpretation of correlations (Cohen’s criteria) is undermined</w:t>
+        <w:t xml:space="preserve">Analyses of the same dataset of 7503 item pairs</w:t>
       </w:r>
     </w:p>
     <w:p>
@@ -1643,7 +1892,63 @@
         </w:numPr>
       </w:pPr>
       <w:r>
-        <w:t xml:space="preserve">It is also undermined by every correlation being expressed on its own unique scale/unique calibration</w:t>
+        <w:t xml:space="preserve">Other characteristics of these include</w:t>
+      </w:r>
+    </w:p>
+    <w:p>
+      <w:pPr>
+        <w:pStyle w:val="Compact"/>
+        <w:numPr>
+          <w:ilvl w:val="1"/>
+          <w:numId w:val="1028"/>
+        </w:numPr>
+      </w:pPr>
+      <w:r>
+        <w:t xml:space="preserve">Characteristics of each of the two vars separately (their variance / skew / kurtosis / mean etc), as well as dyadic characteristics (difference of means / skew/ etc)</w:t>
+      </w:r>
+    </w:p>
+    <w:p>
+      <w:pPr>
+        <w:pStyle w:val="Compact"/>
+        <w:numPr>
+          <w:ilvl w:val="1"/>
+          <w:numId w:val="1028"/>
+        </w:numPr>
+      </w:pPr>
+      <w:r>
+        <w:t xml:space="preserve">Hypotheses/expectations:</w:t>
+      </w:r>
+    </w:p>
+    <w:p>
+      <w:pPr>
+        <w:pStyle w:val="Compact"/>
+        <w:numPr>
+          <w:ilvl w:val="2"/>
+          <w:numId w:val="1029"/>
+        </w:numPr>
+      </w:pPr>
+      <w:r>
+        <w:t xml:space="preserve">Effect of difference of means and of difference of skew</w:t>
+      </w:r>
+    </w:p>
+    <w:p>
+      <w:pPr>
+        <w:pStyle w:val="Compact"/>
+        <w:numPr>
+          <w:ilvl w:val="2"/>
+          <w:numId w:val="1029"/>
+        </w:numPr>
+      </w:pPr>
+      <w:r>
+        <w:t xml:space="preserve">Perhaps effect of number of categories (constrainment less severe the larger the number of categories)</w:t>
+      </w:r>
+    </w:p>
+    <w:p>
+      <w:pPr>
+        <w:pStyle w:val="FirstParagraph"/>
+      </w:pPr>
+      <w:r>
+        <w:t xml:space="preserve">Consequences of constrained correlations in applied research</w:t>
       </w:r>
     </w:p>
     <w:p>
@@ -1651,7 +1956,31 @@
         <w:pStyle w:val="Compact"/>
         <w:numPr>
           <w:ilvl w:val="0"/>
-          <w:numId w:val="1027"/>
+          <w:numId w:val="1030"/>
+        </w:numPr>
+      </w:pPr>
+      <w:r>
+        <w:t xml:space="preserve">Descriptive interpretation of correlations (Cohen’s criteria) is undermined</w:t>
+      </w:r>
+    </w:p>
+    <w:p>
+      <w:pPr>
+        <w:pStyle w:val="Compact"/>
+        <w:numPr>
+          <w:ilvl w:val="0"/>
+          <w:numId w:val="1030"/>
+        </w:numPr>
+      </w:pPr>
+      <w:r>
+        <w:t xml:space="preserve">It is also undermined by every correlation being expressed on its own unique scale/unique calibration</w:t>
+      </w:r>
+    </w:p>
+    <w:p>
+      <w:pPr>
+        <w:pStyle w:val="Compact"/>
+        <w:numPr>
+          <w:ilvl w:val="0"/>
+          <w:numId w:val="1030"/>
         </w:numPr>
       </w:pPr>
       <w:r>
@@ -1791,14 +2120,14 @@
         <w:t xml:space="preserve">: is it smaller because the linear relationship is weaker, or because he constrainment is stronger?</w:t>
       </w:r>
     </w:p>
-    <w:bookmarkEnd w:id="25"/>
-    <w:bookmarkStart w:id="26" w:name="background-and-definitions"/>
+    <w:bookmarkEnd w:id="26"/>
+    <w:bookmarkStart w:id="27" w:name="background-and-definitions"/>
     <w:p>
       <w:pPr>
         <w:pStyle w:val="Heading2"/>
       </w:pPr>
       <w:r>
-        <w:t xml:space="preserve">2.3 Background and Definitions</w:t>
+        <w:t xml:space="preserve">3.3 Background and Definitions</w:t>
       </w:r>
     </w:p>
     <w:p>
@@ -1806,7 +2135,7 @@
         <w:pStyle w:val="Compact"/>
         <w:numPr>
           <w:ilvl w:val="0"/>
-          <w:numId w:val="1028"/>
+          <w:numId w:val="1031"/>
         </w:numPr>
       </w:pPr>
       <w:r>
@@ -1821,7 +2150,7 @@
         <w:pStyle w:val="Compact"/>
         <w:numPr>
           <w:ilvl w:val="0"/>
-          <w:numId w:val="1028"/>
+          <w:numId w:val="1031"/>
         </w:numPr>
       </w:pPr>
       <w:r>
@@ -1836,31 +2165,31 @@
         <w:pStyle w:val="Compact"/>
         <w:numPr>
           <w:ilvl w:val="0"/>
-          <w:numId w:val="1028"/>
+          <w:numId w:val="1031"/>
         </w:numPr>
       </w:pPr>
       <w:r>
         <w:t xml:space="preserve">Coupling and rearrangement in discrete settings</w:t>
       </w:r>
     </w:p>
-    <w:bookmarkEnd w:id="26"/>
     <w:bookmarkEnd w:id="27"/>
-    <w:bookmarkStart w:id="31" w:name="theoretical-framework"/>
+    <w:bookmarkEnd w:id="28"/>
+    <w:bookmarkStart w:id="32" w:name="theoretical-framework"/>
     <w:p>
       <w:pPr>
         <w:pStyle w:val="Heading1"/>
       </w:pPr>
       <w:r>
-        <w:t xml:space="preserve">3. Theoretical Framework</w:t>
-      </w:r>
-    </w:p>
-    <w:bookmarkStart w:id="30" w:name="optimal-coupling-and-correlation-bounds"/>
+        <w:t xml:space="preserve">4. Theoretical Framework</w:t>
+      </w:r>
+    </w:p>
+    <w:bookmarkStart w:id="31" w:name="optimal-coupling-and-correlation-bounds"/>
     <w:p>
       <w:pPr>
         <w:pStyle w:val="Heading2"/>
       </w:pPr>
       <w:r>
-        <w:t xml:space="preserve">3.1 Optimal Coupling and Correlation Bounds</w:t>
+        <w:t xml:space="preserve">4.1 Optimal Coupling and Correlation Bounds</w:t>
       </w:r>
     </w:p>
     <w:p>
@@ -1871,8 +2200,8 @@
         <w:t xml:space="preserve">We formalize the problem of identifying the joint distribution (coupling) of two ordinal variables with fixed marginals that maximizes or minimizes the Pearson correlation.</w:t>
       </w:r>
     </w:p>
-    <w:bookmarkStart w:id="28" w:name="prop-max-product"/>
-    <w:bookmarkEnd w:id="28"/>
+    <w:bookmarkStart w:id="29" w:name="prop-max-product"/>
+    <w:bookmarkEnd w:id="29"/>
     <w:p>
       <w:pPr>
         <w:pStyle w:val="BodyText"/>
@@ -3642,7 +3971,7 @@
       <w:pPr>
         <w:numPr>
           <w:ilvl w:val="0"/>
-          <w:numId w:val="1029"/>
+          <w:numId w:val="1032"/>
         </w:numPr>
       </w:pPr>
       <w:r>
@@ -3675,7 +4004,7 @@
       <w:pPr>
         <w:numPr>
           <w:ilvl w:val="0"/>
-          <w:numId w:val="1029"/>
+          <w:numId w:val="1032"/>
         </w:numPr>
       </w:pPr>
       <w:r>
@@ -3855,7 +4184,7 @@
       <w:pPr>
         <w:numPr>
           <w:ilvl w:val="0"/>
-          <w:numId w:val="1030"/>
+          <w:numId w:val="1033"/>
         </w:numPr>
       </w:pPr>
       <w:r>
@@ -4041,7 +4370,7 @@
       <w:pPr>
         <w:numPr>
           <w:ilvl w:val="0"/>
-          <w:numId w:val="1030"/>
+          <w:numId w:val="1033"/>
         </w:numPr>
       </w:pPr>
       <w:r>
@@ -5424,7 +5753,7 @@
       <w:pPr>
         <w:numPr>
           <w:ilvl w:val="0"/>
-          <w:numId w:val="1031"/>
+          <w:numId w:val="1034"/>
         </w:numPr>
       </w:pPr>
       <w:r>
@@ -5490,7 +5819,7 @@
         <w:pStyle w:val="Compact"/>
         <w:numPr>
           <w:ilvl w:val="1"/>
-          <w:numId w:val="1032"/>
+          <w:numId w:val="1035"/>
         </w:numPr>
       </w:pPr>
       <w:r>
@@ -5556,7 +5885,7 @@
         <w:pStyle w:val="Compact"/>
         <w:numPr>
           <w:ilvl w:val="2"/>
-          <w:numId w:val="1033"/>
+          <w:numId w:val="1036"/>
         </w:numPr>
       </w:pPr>
       <w:r>
@@ -5752,7 +6081,7 @@
       <w:pPr>
         <w:numPr>
           <w:ilvl w:val="0"/>
-          <w:numId w:val="1031"/>
+          <w:numId w:val="1034"/>
         </w:numPr>
       </w:pPr>
       <w:r>
@@ -6129,7 +6458,7 @@
       <w:pPr>
         <w:numPr>
           <w:ilvl w:val="0"/>
-          <w:numId w:val="1034"/>
+          <w:numId w:val="1037"/>
         </w:numPr>
       </w:pPr>
       <w:r>
@@ -6244,7 +6573,7 @@
       <w:pPr>
         <w:numPr>
           <w:ilvl w:val="0"/>
-          <w:numId w:val="1034"/>
+          <w:numId w:val="1037"/>
         </w:numPr>
       </w:pPr>
       <w:r>
@@ -6829,7 +7158,7 @@
         <w:pStyle w:val="Compact"/>
         <w:numPr>
           <w:ilvl w:val="0"/>
-          <w:numId w:val="1035"/>
+          <w:numId w:val="1038"/>
         </w:numPr>
       </w:pPr>
       <w:r>
@@ -8159,7 +8488,7 @@
         <w:pStyle w:val="Compact"/>
         <w:numPr>
           <w:ilvl w:val="0"/>
-          <w:numId w:val="1036"/>
+          <w:numId w:val="1039"/>
         </w:numPr>
       </w:pPr>
       <w:r>
@@ -8353,18 +8682,18 @@
         <w:rPr>
           <w:rStyle w:val="FootnoteReference"/>
         </w:rPr>
-        <w:footnoteReference w:id="29"/>
-      </w:r>
-    </w:p>
-    <w:bookmarkEnd w:id="30"/>
+        <w:footnoteReference w:id="30"/>
+      </w:r>
+    </w:p>
     <w:bookmarkEnd w:id="31"/>
-    <w:bookmarkStart w:id="38" w:name="X17e3cf3f19165181793b69fa8149327f3f6df82"/>
+    <w:bookmarkEnd w:id="32"/>
+    <w:bookmarkStart w:id="40" w:name="X17e3cf3f19165181793b69fa8149327f3f6df82"/>
     <w:p>
       <w:pPr>
         <w:pStyle w:val="Heading1"/>
       </w:pPr>
       <w:r>
-        <w:t xml:space="preserve">4. Measurement Issues and Metrics of Constraint</w:t>
+        <w:t xml:space="preserve">5. Measurement Issues and Metrics of Constraint</w:t>
       </w:r>
     </w:p>
     <w:p>
@@ -8884,13 +9213,13 @@
         </m:oMath>
       </m:oMathPara>
     </w:p>
-    <w:bookmarkStart w:id="35" w:name="possible-metrics-of-constraint"/>
+    <w:bookmarkStart w:id="37" w:name="possible-metrics-of-constraint"/>
     <w:p>
       <w:pPr>
         <w:pStyle w:val="Heading2"/>
       </w:pPr>
       <w:r>
-        <w:t xml:space="preserve">4.1 Possible</w:t>
+        <w:t xml:space="preserve">5.1 Possible</w:t>
       </w:r>
       <w:r>
         <w:t xml:space="preserve"> </w:t>
@@ -8899,23 +9228,18 @@
         <w:t xml:space="preserve">“Metrics of Constraint”</w:t>
       </w:r>
     </w:p>
+    <w:bookmarkStart w:id="36" w:name="overlap-based-measures-of-asymmetry"/>
+    <w:p>
+      <w:pPr>
+        <w:pStyle w:val="Heading3"/>
+      </w:pPr>
+      <w:r>
+        <w:t xml:space="preserve">5.1.1 5.7 Overlap-Based Measures of Asymmetry</w:t>
+      </w:r>
+    </w:p>
     <w:p>
       <w:pPr>
         <w:pStyle w:val="FirstParagraph"/>
-      </w:pPr>
-      <w:r>
-        <w:t xml:space="preserve">[TO DO: define these. Add others? ]</w:t>
-      </w:r>
-      <w:r>
-        <w:t xml:space="preserve"> </w:t>
-      </w:r>
-      <w:r>
-        <w:t xml:space="preserve">### 5.7 Overlap-Based Measures of Asymmetry</w:t>
-      </w:r>
-    </w:p>
-    <w:p>
-      <w:pPr>
-        <w:pStyle w:val="BodyText"/>
       </w:pPr>
       <w:r>
         <w:t xml:space="preserve">In addition to Total Variation (TV) distance, other metrics can quantify the structural dissimilarity between a marginal distribution and its reverse. One natural approach is to assess the degree of</w:t>
@@ -8948,13 +9272,13 @@
         <w:t xml:space="preserve">We consider three complementary measures of overlap and their complements:</w:t>
       </w:r>
     </w:p>
-    <w:bookmarkStart w:id="32" w:name="i-total-variation-tv-distance"/>
+    <w:bookmarkStart w:id="33" w:name="i-total-variation-tv-distance"/>
     <w:p>
       <w:pPr>
         <w:pStyle w:val="Heading4"/>
       </w:pPr>
       <w:r>
-        <w:t xml:space="preserve">4.1.0.1 (i) Total Variation (TV) Distance</w:t>
+        <w:t xml:space="preserve">5.1.1.1 (i) Total Variation (TV) Distance</w:t>
       </w:r>
     </w:p>
     <w:p>
@@ -9024,14 +9348,14 @@
         <w:t xml:space="preserve">]</w:t>
       </w:r>
     </w:p>
-    <w:bookmarkEnd w:id="32"/>
-    <w:bookmarkStart w:id="33" w:name="X377ee26bdc1c8ec59ee9ade7562328f61d223bf"/>
+    <w:bookmarkEnd w:id="33"/>
+    <w:bookmarkStart w:id="34" w:name="X377ee26bdc1c8ec59ee9ade7562328f61d223bf"/>
     <w:p>
       <w:pPr>
         <w:pStyle w:val="Heading4"/>
       </w:pPr>
       <w:r>
-        <w:t xml:space="preserve">4.1.0.2 (ii) Bhattacharyya Coefficient (BC) and its Complement</w:t>
+        <w:t xml:space="preserve">5.1.1.2 (ii) Bhattacharyya Coefficient (BC) and its Complement</w:t>
       </w:r>
     </w:p>
     <w:p>
@@ -9110,14 +9434,14 @@
         <w:t xml:space="preserve">), can be interpreted as a divergence-like measure that reflects geometric differences between the original and reversed distributions. While not a metric, it is bounded between 0 and 1, with 0 indicating perfect symmetry.</w:t>
       </w:r>
     </w:p>
-    <w:bookmarkEnd w:id="33"/>
-    <w:bookmarkStart w:id="34" w:name="iii-overlap-coefficient-ovl"/>
+    <w:bookmarkEnd w:id="34"/>
+    <w:bookmarkStart w:id="35" w:name="iii-overlap-coefficient-ovl"/>
     <w:p>
       <w:pPr>
         <w:pStyle w:val="Heading4"/>
       </w:pPr>
       <w:r>
-        <w:t xml:space="preserve">4.1.0.3 (iii) Overlap Coefficient (OVL)</w:t>
+        <w:t xml:space="preserve">5.1.1.3 (iii) Overlap Coefficient (OVL)</w:t>
       </w:r>
     </w:p>
     <w:p>
@@ -9265,15 +9589,16 @@
         <w:t xml:space="preserve">Empirically, we find that all three metrics provide consistent, interpretable diagnostics of distributional asymmetry. Using them jointly provides a robust triangulation of symmetry breaking, especially in applied contexts where ordinal variables are discretized from latent traits or ratings.</w:t>
       </w:r>
     </w:p>
-    <w:bookmarkEnd w:id="34"/>
     <w:bookmarkEnd w:id="35"/>
-    <w:bookmarkStart w:id="36" w:name="symmetry-and-the-role-of-ties"/>
+    <w:bookmarkEnd w:id="36"/>
+    <w:bookmarkEnd w:id="37"/>
+    <w:bookmarkStart w:id="38" w:name="symmetry-and-the-role-of-ties"/>
     <w:p>
       <w:pPr>
         <w:pStyle w:val="Heading2"/>
       </w:pPr>
       <w:r>
-        <w:t xml:space="preserve">4.2 Symmetry and the Role of Ties</w:t>
+        <w:t xml:space="preserve">5.2 Symmetry and the Role of Ties</w:t>
       </w:r>
     </w:p>
     <w:p>
@@ -9281,7 +9606,7 @@
         <w:pStyle w:val="Compact"/>
         <w:numPr>
           <w:ilvl w:val="0"/>
-          <w:numId w:val="1039"/>
+          <w:numId w:val="1042"/>
         </w:numPr>
       </w:pPr>
       <w:r>
@@ -9340,21 +9665,21 @@
         <w:pStyle w:val="Compact"/>
         <w:numPr>
           <w:ilvl w:val="0"/>
-          <w:numId w:val="1039"/>
+          <w:numId w:val="1042"/>
         </w:numPr>
       </w:pPr>
       <w:r>
         <w:t xml:space="preserve">How ties in marginal distributions affect the attainability of the lower bound</w:t>
       </w:r>
     </w:p>
-    <w:bookmarkEnd w:id="36"/>
-    <w:bookmarkStart w:id="37" w:name="special-cases-and-boundary-conditions"/>
+    <w:bookmarkEnd w:id="38"/>
+    <w:bookmarkStart w:id="39" w:name="special-cases-and-boundary-conditions"/>
     <w:p>
       <w:pPr>
         <w:pStyle w:val="Heading2"/>
       </w:pPr>
       <w:r>
-        <w:t xml:space="preserve">4.3 Special Cases and Boundary Conditions</w:t>
+        <w:t xml:space="preserve">5.3 Special Cases and Boundary Conditions</w:t>
       </w:r>
     </w:p>
     <w:p>
@@ -9362,7 +9687,7 @@
         <w:pStyle w:val="Compact"/>
         <w:numPr>
           <w:ilvl w:val="0"/>
-          <w:numId w:val="1040"/>
+          <w:numId w:val="1043"/>
         </w:numPr>
       </w:pPr>
       <w:r>
@@ -9377,22 +9702,44 @@
         <w:pStyle w:val="Compact"/>
         <w:numPr>
           <w:ilvl w:val="0"/>
-          <w:numId w:val="1040"/>
+          <w:numId w:val="1043"/>
         </w:numPr>
       </w:pPr>
       <w:r>
         <w:t xml:space="preserve">Symmetric vs. asymmetric marginal distributions</w:t>
       </w:r>
     </w:p>
-    <w:bookmarkEnd w:id="37"/>
-    <w:bookmarkEnd w:id="38"/>
-    <w:bookmarkStart w:id="42" w:name="monte-carlo-simulations"/>
+    <w:bookmarkEnd w:id="39"/>
+    <w:bookmarkEnd w:id="40"/>
+    <w:bookmarkStart w:id="41" w:name="implications-issues-and-questions"/>
     <w:p>
       <w:pPr>
         <w:pStyle w:val="Heading1"/>
       </w:pPr>
       <w:r>
-        <w:t xml:space="preserve">5. Monte Carlo Simulations</w:t>
+        <w:t xml:space="preserve">6. Implications, Issues, and Questions</w:t>
+      </w:r>
+    </w:p>
+    <w:p>
+      <w:pPr>
+        <w:pStyle w:val="FirstParagraph"/>
+      </w:pPr>
+      <w:r>
+        <w:rPr>
+          <w:b/>
+          <w:bCs/>
+        </w:rPr>
+        <w:t xml:space="preserve">Hypothesis testing here</w:t>
+      </w:r>
+    </w:p>
+    <w:bookmarkEnd w:id="41"/>
+    <w:bookmarkStart w:id="45" w:name="monte-carlo-simulations"/>
+    <w:p>
+      <w:pPr>
+        <w:pStyle w:val="Heading1"/>
+      </w:pPr>
+      <w:r>
+        <w:t xml:space="preserve">7. Monte Carlo Simulations</w:t>
       </w:r>
     </w:p>
     <w:p>
@@ -9400,7 +9747,7 @@
         <w:pStyle w:val="Compact"/>
         <w:numPr>
           <w:ilvl w:val="0"/>
-          <w:numId w:val="1041"/>
+          <w:numId w:val="1044"/>
         </w:numPr>
       </w:pPr>
       <w:r>
@@ -9419,13 +9766,13 @@
         <w:t xml:space="preserve">(data)?</w:t>
       </w:r>
     </w:p>
-    <w:bookmarkStart w:id="39" w:name="Xcd72fa76b031e65432d89eade845911086d9e4d"/>
+    <w:bookmarkStart w:id="42" w:name="Xcd72fa76b031e65432d89eade845911086d9e4d"/>
     <w:p>
       <w:pPr>
         <w:pStyle w:val="Heading2"/>
       </w:pPr>
       <w:r>
-        <w:t xml:space="preserve">5.1 Probabilistic modeling over the</w:t>
+        <w:t xml:space="preserve">7.1 Probabilistic modeling over the</w:t>
       </w:r>
       <w:r>
         <w:t xml:space="preserve"> </w:t>
@@ -9494,21 +9841,21 @@
         <w:t xml:space="preserve">interval (?)</w:t>
       </w:r>
     </w:p>
-    <w:bookmarkEnd w:id="39"/>
-    <w:bookmarkStart w:id="40" w:name="effects-of-marginal-shapes"/>
+    <w:bookmarkEnd w:id="42"/>
+    <w:bookmarkStart w:id="43" w:name="effects-of-marginal-shapes"/>
     <w:p>
       <w:pPr>
         <w:pStyle w:val="Heading2"/>
       </w:pPr>
       <w:r>
-        <w:t xml:space="preserve">5.2 Effects of Marginal Shapes</w:t>
+        <w:t xml:space="preserve">7.2 Effects of Marginal Shapes</w:t>
       </w:r>
     </w:p>
     <w:p>
       <w:pPr>
         <w:numPr>
           <w:ilvl w:val="0"/>
-          <w:numId w:val="1042"/>
+          <w:numId w:val="1045"/>
         </w:numPr>
       </w:pPr>
       <w:r>
@@ -9522,7 +9869,7 @@
       <w:pPr>
         <w:numPr>
           <w:ilvl w:val="0"/>
-          <w:numId w:val="1042"/>
+          <w:numId w:val="1045"/>
         </w:numPr>
       </w:pPr>
       <w:r>
@@ -9544,28 +9891,28 @@
       <w:pPr>
         <w:numPr>
           <w:ilvl w:val="0"/>
-          <w:numId w:val="1042"/>
+          <w:numId w:val="1045"/>
         </w:numPr>
       </w:pPr>
       <w:r>
         <w:t xml:space="preserve">Marginals with extreme concentration (e.g., most responses in one or two categories) sharply restrict the possible correlation range.</w:t>
       </w:r>
     </w:p>
-    <w:bookmarkEnd w:id="40"/>
-    <w:bookmarkStart w:id="41" w:name="symmetry-breaking-in-correlation-bounds"/>
+    <w:bookmarkEnd w:id="43"/>
+    <w:bookmarkStart w:id="44" w:name="symmetry-breaking-in-correlation-bounds"/>
     <w:p>
       <w:pPr>
         <w:pStyle w:val="Heading2"/>
       </w:pPr>
       <w:r>
-        <w:t xml:space="preserve">5.3 Symmetry Breaking in Correlation Bounds</w:t>
+        <w:t xml:space="preserve">7.3 Symmetry Breaking in Correlation Bounds</w:t>
       </w:r>
     </w:p>
     <w:p>
       <w:pPr>
         <w:numPr>
           <w:ilvl w:val="0"/>
-          <w:numId w:val="1043"/>
+          <w:numId w:val="1046"/>
         </w:numPr>
       </w:pPr>
       <w:r>
@@ -9623,7 +9970,7 @@
       <w:pPr>
         <w:numPr>
           <w:ilvl w:val="0"/>
-          <w:numId w:val="1043"/>
+          <w:numId w:val="1046"/>
         </w:numPr>
       </w:pPr>
       <w:r>
@@ -9634,7 +9981,7 @@
       <w:pPr>
         <w:numPr>
           <w:ilvl w:val="0"/>
-          <w:numId w:val="1043"/>
+          <w:numId w:val="1046"/>
         </w:numPr>
       </w:pPr>
       <w:r>
@@ -9659,7 +10006,7 @@
       <w:pPr>
         <w:numPr>
           <w:ilvl w:val="0"/>
-          <w:numId w:val="1043"/>
+          <w:numId w:val="1046"/>
         </w:numPr>
       </w:pPr>
       <w:r>
@@ -9782,7 +10129,7 @@
         <w:pStyle w:val="Compact"/>
         <w:numPr>
           <w:ilvl w:val="0"/>
-          <w:numId w:val="1044"/>
+          <w:numId w:val="1047"/>
         </w:numPr>
       </w:pPr>
       <w:r>
@@ -9794,7 +10141,7 @@
         <w:pStyle w:val="Compact"/>
         <w:numPr>
           <w:ilvl w:val="0"/>
-          <w:numId w:val="1044"/>
+          <w:numId w:val="1047"/>
         </w:numPr>
       </w:pPr>
       <w:r>
@@ -9831,7 +10178,7 @@
         <w:pStyle w:val="Compact"/>
         <w:numPr>
           <w:ilvl w:val="0"/>
-          <w:numId w:val="1044"/>
+          <w:numId w:val="1047"/>
         </w:numPr>
       </w:pPr>
       <w:r>
@@ -9860,15 +10207,15 @@
         </m:r>
       </m:oMath>
     </w:p>
-    <w:bookmarkEnd w:id="41"/>
-    <w:bookmarkEnd w:id="42"/>
-    <w:bookmarkStart w:id="43" w:name="illustration-with-typical-data-bes"/>
+    <w:bookmarkEnd w:id="44"/>
+    <w:bookmarkEnd w:id="45"/>
+    <w:bookmarkStart w:id="46" w:name="illustration-with-typical-data-bes"/>
     <w:p>
       <w:pPr>
         <w:pStyle w:val="Heading1"/>
       </w:pPr>
       <w:r>
-        <w:t xml:space="preserve">6. Illustration with</w:t>
+        <w:t xml:space="preserve">8. Illustration with</w:t>
       </w:r>
       <w:r>
         <w:t xml:space="preserve"> </w:t>
@@ -9907,22 +10254,14 @@
         <w:t xml:space="preserve">in that it is a real-world example possessing many of the features that would raise issues…</w:t>
       </w:r>
     </w:p>
-    <w:bookmarkEnd w:id="43"/>
-    <w:bookmarkStart w:id="44" w:name="applications-and-implications"/>
+    <w:bookmarkEnd w:id="46"/>
+    <w:bookmarkStart w:id="48" w:name="conclusion"/>
     <w:p>
       <w:pPr>
         <w:pStyle w:val="Heading1"/>
       </w:pPr>
       <w:r>
-        <w:t xml:space="preserve">7. Applications and Implications</w:t>
-      </w:r>
-    </w:p>
-    <w:p>
-      <w:pPr>
-        <w:pStyle w:val="FirstParagraph"/>
-      </w:pPr>
-      <w:r>
-        <w:t xml:space="preserve">Impacts standard methods:</w:t>
+        <w:t xml:space="preserve">9. Conclusion</w:t>
       </w:r>
     </w:p>
     <w:p>
@@ -9930,18 +10269,221 @@
         <w:pStyle w:val="Compact"/>
         <w:numPr>
           <w:ilvl w:val="0"/>
-          <w:numId w:val="1045"/>
+          <w:numId w:val="1048"/>
         </w:numPr>
       </w:pPr>
       <w:r>
-        <w:rPr>
-          <w:b/>
-          <w:bCs/>
-        </w:rPr>
-        <w:t xml:space="preserve">PCA and Factor Analysis</w:t>
-      </w:r>
-      <w:r>
-        <w:t xml:space="preserve">: Attenuated correlations may lead to</w:t>
+        <w:t xml:space="preserve">Summary: Theoretical bounds, symmetry-breaking conditions, and implications for applied research</w:t>
+      </w:r>
+    </w:p>
+    <w:p>
+      <w:pPr>
+        <w:pStyle w:val="Compact"/>
+        <w:numPr>
+          <w:ilvl w:val="0"/>
+          <w:numId w:val="1048"/>
+        </w:numPr>
+      </w:pPr>
+      <w:r>
+        <w:t xml:space="preserve">An R package accompanies this paper, providing tools to compute max/min bounds and perform randomization-based hypothesis tests for fixed marginals. Details are available in the appendix and online.</w:t>
+      </w:r>
+    </w:p>
+    <w:p>
+      <w:pPr>
+        <w:pStyle w:val="FirstParagraph"/>
+      </w:pPr>
+      <w:r>
+        <w:t xml:space="preserve">Impacts standard methods:</w:t>
+      </w:r>
+    </w:p>
+    <w:p>
+      <w:pPr>
+        <w:pStyle w:val="Compact"/>
+        <w:numPr>
+          <w:ilvl w:val="0"/>
+          <w:numId w:val="1049"/>
+        </w:numPr>
+      </w:pPr>
+      <w:r>
+        <w:t xml:space="preserve">interpretation (e.g. </w:t>
+      </w:r>
+      <w:r>
+        <w:t xml:space="preserve">‘effect size’</w:t>
+      </w:r>
+      <w:r>
+        <w:t xml:space="preserve">) and comparison</w:t>
+      </w:r>
+    </w:p>
+    <w:p>
+      <w:pPr>
+        <w:pStyle w:val="Compact"/>
+        <w:numPr>
+          <w:ilvl w:val="0"/>
+          <w:numId w:val="1049"/>
+        </w:numPr>
+      </w:pPr>
+      <w:r>
+        <w:t xml:space="preserve">hyothesis testing</w:t>
+      </w:r>
+    </w:p>
+    <w:p>
+      <w:pPr>
+        <w:pStyle w:val="FirstParagraph"/>
+      </w:pPr>
+      <w:r>
+        <w:t xml:space="preserve">Recommendations for interpreting Pearson’s</w:t>
+      </w:r>
+      <w:r>
+        <w:t xml:space="preserve"> </w:t>
+      </w:r>
+      <m:oMath>
+        <m:r>
+          <m:t>r</m:t>
+        </m:r>
+      </m:oMath>
+      <w:r>
+        <w:t xml:space="preserve"> </w:t>
+      </w:r>
+      <w:r>
+        <w:t xml:space="preserve">in applied contexts</w:t>
+      </w:r>
+    </w:p>
+    <w:p>
+      <w:pPr>
+        <w:pStyle w:val="Compact"/>
+        <w:numPr>
+          <w:ilvl w:val="0"/>
+          <w:numId w:val="1050"/>
+        </w:numPr>
+      </w:pPr>
+      <w:r>
+        <w:t xml:space="preserve">Reporting observed</w:t>
+      </w:r>
+      <w:r>
+        <w:t xml:space="preserve"> </w:t>
+      </w:r>
+      <m:oMath>
+        <m:r>
+          <m:t>r</m:t>
+        </m:r>
+      </m:oMath>
+      <w:r>
+        <w:t xml:space="preserve"> </w:t>
+      </w:r>
+      <w:r>
+        <w:t xml:space="preserve">in context of its attainable bounds.</w:t>
+      </w:r>
+    </w:p>
+    <w:p>
+      <w:pPr>
+        <w:pStyle w:val="Compact"/>
+        <w:numPr>
+          <w:ilvl w:val="0"/>
+          <w:numId w:val="1050"/>
+        </w:numPr>
+      </w:pPr>
+      <w:r>
+        <w:t xml:space="preserve">Using our tools to test whether an observed</w:t>
+      </w:r>
+      <w:r>
+        <w:t xml:space="preserve"> </w:t>
+      </w:r>
+      <m:oMath>
+        <m:r>
+          <m:t>r</m:t>
+        </m:r>
+      </m:oMath>
+      <w:r>
+        <w:t xml:space="preserve"> </w:t>
+      </w:r>
+      <w:r>
+        <w:t xml:space="preserve">is unusually strong or weak given marginals.</w:t>
+      </w:r>
+    </w:p>
+    <w:bookmarkStart w:id="47" w:name="extensions-and-open-questions"/>
+    <w:p>
+      <w:pPr>
+        <w:pStyle w:val="Heading2"/>
+      </w:pPr>
+      <w:r>
+        <w:t xml:space="preserve">9.1 Extensions and Open Questions</w:t>
+      </w:r>
+    </w:p>
+    <w:p>
+      <w:pPr>
+        <w:pStyle w:val="Compact"/>
+        <w:numPr>
+          <w:ilvl w:val="0"/>
+          <w:numId w:val="1051"/>
+        </w:numPr>
+      </w:pPr>
+      <w:r>
+        <w:t xml:space="preserve">Role of entropy and joint uncertainty in bounding behavior</w:t>
+      </w:r>
+      <w:r>
+        <w:br/>
+      </w:r>
+    </w:p>
+    <w:p>
+      <w:pPr>
+        <w:pStyle w:val="Compact"/>
+        <w:numPr>
+          <w:ilvl w:val="0"/>
+          <w:numId w:val="1051"/>
+        </w:numPr>
+      </w:pPr>
+      <w:r>
+        <w:t xml:space="preserve">Possibility of adjusting or normalizing</w:t>
+      </w:r>
+      <w:r>
+        <w:t xml:space="preserve"> </w:t>
+      </w:r>
+      <m:oMath>
+        <m:r>
+          <m:t>r</m:t>
+        </m:r>
+      </m:oMath>
+    </w:p>
+    <w:p>
+      <w:pPr>
+        <w:pStyle w:val="Compact"/>
+        <w:numPr>
+          <w:ilvl w:val="0"/>
+          <w:numId w:val="1051"/>
+        </w:numPr>
+      </w:pPr>
+      <w:r>
+        <w:t xml:space="preserve">Relation to Copula Theory (Optional)</w:t>
+      </w:r>
+    </w:p>
+    <w:p>
+      <w:pPr>
+        <w:pStyle w:val="Compact"/>
+        <w:numPr>
+          <w:ilvl w:val="1"/>
+          <w:numId w:val="1052"/>
+        </w:numPr>
+      </w:pPr>
+      <w:r>
+        <w:t xml:space="preserve">“Although our setting is discrete, the problem is conceptually linked to copula-based modeling of dependence with fixed marginals. The connection is discussed as a direction for future work.”</w:t>
+      </w:r>
+    </w:p>
+    <w:p>
+      <w:pPr>
+        <w:pStyle w:val="Compact"/>
+        <w:numPr>
+          <w:ilvl w:val="0"/>
+          <w:numId w:val="1051"/>
+        </w:numPr>
+      </w:pPr>
+      <w:r>
+        <w:t xml:space="preserve">‘Correction’</w:t>
+      </w:r>
+      <w:r>
+        <w:t xml:space="preserve"> </w:t>
+      </w:r>
+      <w:r>
+        <w:t xml:space="preserve">strategies</w:t>
       </w:r>
       <w:r>
         <w:t xml:space="preserve"> </w:t>
@@ -9954,16 +10496,80 @@
           <m:t>⤳</m:t>
         </m:r>
       </m:oMath>
-    </w:p>
-    <w:p>
-      <w:pPr>
+      <w:r>
+        <w:t xml:space="preserve"> </w:t>
+      </w:r>
+      <w:r>
+        <w:rPr>
+          <w:i/>
+          <w:iCs/>
+        </w:rPr>
+        <w:t xml:space="preserve">rescaling</w:t>
+      </w:r>
+    </w:p>
+    <w:p>
+      <w:pPr>
+        <w:pStyle w:val="Compact"/>
+        <w:numPr>
+          <w:ilvl w:val="0"/>
+          <w:numId w:val="1051"/>
+        </w:numPr>
+      </w:pPr>
+      <w:r>
+        <w:t xml:space="preserve">Generalizations to higher dimensions</w:t>
+      </w:r>
+      <w:r>
+        <w:t xml:space="preserve"> </w:t>
+      </w:r>
+      <m:oMath>
+        <m:r>
+          <m:rPr>
+            <m:sty m:val="p"/>
+          </m:rPr>
+          <m:t>⤳</m:t>
+        </m:r>
+      </m:oMath>
+      <w:r>
+        <w:t xml:space="preserve"> </w:t>
+      </w:r>
+      <w:r>
+        <w:t xml:space="preserve">implications for correlation matricies and Factor Analysis, SEMs, etc.</w:t>
+      </w:r>
+    </w:p>
+    <w:p>
+      <w:pPr>
+        <w:pStyle w:val="Compact"/>
         <w:numPr>
           <w:ilvl w:val="1"/>
-          <w:numId w:val="1046"/>
+          <w:numId w:val="1053"/>
         </w:numPr>
       </w:pPr>
       <w:r>
-        <w:t xml:space="preserve">Practical risks: over-factoring (more factors estimated than</w:t>
+        <w:rPr>
+          <w:b/>
+          <w:bCs/>
+        </w:rPr>
+        <w:t xml:space="preserve">PCA and Factor Analysis</w:t>
+      </w:r>
+      <w:r>
+        <w:t xml:space="preserve">: Attenuated correlations may lead to</w:t>
+      </w:r>
+      <w:r>
+        <w:t xml:space="preserve"> </w:t>
+      </w:r>
+      <m:oMath>
+        <m:r>
+          <m:rPr>
+            <m:sty m:val="p"/>
+          </m:rPr>
+          <m:t>⤳</m:t>
+        </m:r>
+      </m:oMath>
+      <w:r>
+        <w:t xml:space="preserve"> </w:t>
+      </w:r>
+      <w:r>
+        <w:t xml:space="preserve">ractical risks: over-factoring (more factors estimated than</w:t>
       </w:r>
       <w:r>
         <w:t xml:space="preserve"> </w:t>
@@ -9977,9 +10583,10 @@
     </w:p>
     <w:p>
       <w:pPr>
+        <w:pStyle w:val="Compact"/>
         <w:numPr>
-          <w:ilvl w:val="1"/>
-          <w:numId w:val="1046"/>
+          <w:ilvl w:val="2"/>
+          <w:numId w:val="1054"/>
         </w:numPr>
       </w:pPr>
       <w:r>
@@ -9990,381 +10597,27 @@
         <w:t xml:space="preserve">SEM</w:t>
       </w:r>
       <w:r>
-        <w:t xml:space="preserve">: Biased estimation of structural paths if ordinal-level</w:t>
-      </w:r>
-      <w:r>
-        <w:t xml:space="preserve"> </w:t>
-      </w:r>
-      <w:r>
-        <w:t xml:space="preserve">attenuation is ignored.</w:t>
-      </w:r>
-    </w:p>
-    <w:p>
-      <w:pPr>
-        <w:pStyle w:val="FirstParagraph"/>
-      </w:pPr>
-      <w:r>
-        <w:t xml:space="preserve">Recommendations for interpreting Pearson’s</w:t>
-      </w:r>
-      <w:r>
-        <w:t xml:space="preserve"> </w:t>
-      </w:r>
-      <m:oMath>
-        <m:r>
-          <m:t>r</m:t>
-        </m:r>
-      </m:oMath>
-      <w:r>
-        <w:t xml:space="preserve"> </w:t>
-      </w:r>
-      <w:r>
-        <w:t xml:space="preserve">in applied contexts</w:t>
-      </w:r>
-    </w:p>
-    <w:p>
-      <w:pPr>
-        <w:pStyle w:val="Compact"/>
-        <w:numPr>
-          <w:ilvl w:val="0"/>
-          <w:numId w:val="1047"/>
-        </w:numPr>
-      </w:pPr>
-      <w:r>
-        <w:t xml:space="preserve">Reporting observed</w:t>
-      </w:r>
-      <w:r>
-        <w:t xml:space="preserve"> </w:t>
-      </w:r>
-      <m:oMath>
-        <m:r>
-          <m:t>r</m:t>
-        </m:r>
-      </m:oMath>
-      <w:r>
-        <w:t xml:space="preserve"> </w:t>
-      </w:r>
-      <w:r>
-        <w:t xml:space="preserve">in context of its attainable bounds.</w:t>
-      </w:r>
-    </w:p>
-    <w:p>
-      <w:pPr>
-        <w:pStyle w:val="Compact"/>
-        <w:numPr>
-          <w:ilvl w:val="0"/>
-          <w:numId w:val="1047"/>
-        </w:numPr>
-      </w:pPr>
-      <w:r>
-        <w:t xml:space="preserve">Using our tools to test whether an observed</w:t>
-      </w:r>
-      <w:r>
-        <w:t xml:space="preserve"> </w:t>
-      </w:r>
-      <m:oMath>
-        <m:r>
-          <m:t>r</m:t>
-        </m:r>
-      </m:oMath>
-      <w:r>
-        <w:t xml:space="preserve"> </w:t>
-      </w:r>
-      <w:r>
-        <w:t xml:space="preserve">is unusually strong or weak given marginals.</w:t>
-      </w:r>
-    </w:p>
-    <w:bookmarkEnd w:id="44"/>
-    <w:bookmarkStart w:id="46" w:name="extensions-and-open-questions"/>
+        <w:t xml:space="preserve">: Biased estimation of structural paths if ordinal-level attenuation is ignored.</w:t>
+      </w:r>
+    </w:p>
+    <w:p>
+      <w:r>
+        <w:br w:type="page"/>
+      </w:r>
+    </w:p>
+    <w:bookmarkEnd w:id="47"/>
+    <w:bookmarkEnd w:id="48"/>
+    <w:bookmarkStart w:id="64" w:name="references"/>
     <w:p>
       <w:pPr>
         <w:pStyle w:val="Heading1"/>
       </w:pPr>
       <w:r>
-        <w:t xml:space="preserve">8. Extensions and Open Questions</w:t>
-      </w:r>
-    </w:p>
-    <w:p>
-      <w:pPr>
-        <w:pStyle w:val="Compact"/>
-        <w:numPr>
-          <w:ilvl w:val="0"/>
-          <w:numId w:val="1048"/>
-        </w:numPr>
-      </w:pPr>
-      <w:r>
-        <w:t xml:space="preserve">Role of entropy and joint uncertainty in bounding behavior</w:t>
-      </w:r>
-      <w:r>
-        <w:br/>
-      </w:r>
-    </w:p>
-    <w:p>
-      <w:pPr>
-        <w:pStyle w:val="Compact"/>
-        <w:numPr>
-          <w:ilvl w:val="0"/>
-          <w:numId w:val="1048"/>
-        </w:numPr>
-      </w:pPr>
-      <w:r>
-        <w:t xml:space="preserve">Possibility of adjusting or normalizing</w:t>
-      </w:r>
-      <w:r>
-        <w:t xml:space="preserve"> </w:t>
-      </w:r>
-      <m:oMath>
-        <m:r>
-          <m:t>r</m:t>
-        </m:r>
-      </m:oMath>
-    </w:p>
-    <w:p>
-      <w:pPr>
-        <w:pStyle w:val="Compact"/>
-        <w:numPr>
-          <w:ilvl w:val="0"/>
-          <w:numId w:val="1048"/>
-        </w:numPr>
-      </w:pPr>
-      <w:r>
-        <w:t xml:space="preserve">Relation to Copula Theory (Optional)</w:t>
-      </w:r>
-    </w:p>
-    <w:p>
-      <w:pPr>
-        <w:pStyle w:val="Compact"/>
-        <w:numPr>
-          <w:ilvl w:val="1"/>
-          <w:numId w:val="1049"/>
-        </w:numPr>
-      </w:pPr>
-      <w:r>
-        <w:t xml:space="preserve">“Although our setting is discrete, the problem is conceptually linked to copula-based modeling of dependence with fixed marginals. The connection is discussed as a direction for future work.”</w:t>
-      </w:r>
-    </w:p>
-    <w:bookmarkStart w:id="45" w:name="to-do"/>
-    <w:p>
-      <w:pPr>
-        <w:pStyle w:val="Heading2"/>
-      </w:pPr>
-      <w:r>
-        <w:t xml:space="preserve">8.1 To Do</w:t>
-      </w:r>
-    </w:p>
-    <w:p>
-      <w:pPr>
-        <w:pStyle w:val="Compact"/>
-        <w:numPr>
-          <w:ilvl w:val="0"/>
-          <w:numId w:val="1050"/>
-        </w:numPr>
-      </w:pPr>
-      <w:r>
-        <w:t xml:space="preserve">Can</w:t>
-      </w:r>
-      <w:r>
-        <w:t xml:space="preserve"> </w:t>
-      </w:r>
-      <m:oMath>
-        <m:sSub>
-          <m:e>
-            <m:r>
-              <m:t>r</m:t>
-            </m:r>
-          </m:e>
-          <m:sub>
-            <m:r>
-              <m:t>m</m:t>
-            </m:r>
-            <m:r>
-              <m:t>i</m:t>
-            </m:r>
-            <m:r>
-              <m:t>n</m:t>
-            </m:r>
-          </m:sub>
-        </m:sSub>
-        <m:r>
-          <m:rPr>
-            <m:sty m:val="p"/>
-          </m:rPr>
-          <m:t>&gt;</m:t>
-        </m:r>
-        <m:r>
-          <m:t>0</m:t>
-        </m:r>
-      </m:oMath>
-      <w:r>
-        <w:t xml:space="preserve">?</w:t>
-      </w:r>
-    </w:p>
-    <w:p>
-      <w:pPr>
-        <w:pStyle w:val="Compact"/>
-        <w:numPr>
-          <w:ilvl w:val="0"/>
-          <w:numId w:val="1050"/>
-        </w:numPr>
-      </w:pPr>
-      <w:r>
-        <w:t xml:space="preserve">Are there systematic biases in testing</w:t>
-      </w:r>
-      <w:r>
-        <w:t xml:space="preserve"> </w:t>
-      </w:r>
-      <m:oMath>
-        <m:sSub>
-          <m:e>
-            <m:r>
-              <m:t>H</m:t>
-            </m:r>
-          </m:e>
-          <m:sub>
-            <m:r>
-              <m:t>0</m:t>
-            </m:r>
-          </m:sub>
-        </m:sSub>
-        <m:r>
-          <m:rPr>
-            <m:sty m:val="p"/>
-          </m:rPr>
-          <m:t>:</m:t>
-        </m:r>
-        <m:r>
-          <m:t>r</m:t>
-        </m:r>
-        <m:r>
-          <m:rPr>
-            <m:sty m:val="p"/>
-          </m:rPr>
-          <m:t>=</m:t>
-        </m:r>
-        <m:r>
-          <m:t>0</m:t>
-        </m:r>
-      </m:oMath>
-      <w:r>
-        <w:t xml:space="preserve"> </w:t>
-      </w:r>
-      <w:r>
-        <w:t xml:space="preserve">using t-test? (Answer with Monte Carlo simulated data?)</w:t>
-      </w:r>
-    </w:p>
-    <w:p>
-      <w:pPr>
-        <w:pStyle w:val="Compact"/>
-        <w:numPr>
-          <w:ilvl w:val="0"/>
-          <w:numId w:val="1050"/>
-        </w:numPr>
-      </w:pPr>
-      <w:r>
-        <w:t xml:space="preserve">Add: “</w:t>
-      </w:r>
-      <m:oMath>
-        <m:sSub>
-          <m:e>
-            <m:r>
-              <m:t>r</m:t>
-            </m:r>
-          </m:e>
-          <m:sub>
-            <m:r>
-              <m:t>m</m:t>
-            </m:r>
-          </m:sub>
-        </m:sSub>
-        <m:r>
-          <m:t>i</m:t>
-        </m:r>
-        <m:r>
-          <m:t>n</m:t>
-        </m:r>
-      </m:oMath>
-      <w:r>
-        <w:t xml:space="preserve"> </w:t>
-      </w:r>
-      <w:r>
-        <w:t xml:space="preserve">is invariant to</w:t>
-      </w:r>
-      <w:r>
-        <w:t xml:space="preserve"> </w:t>
-      </w:r>
-      <w:r>
-        <w:t xml:space="preserve">‘problem 1’</w:t>
-      </w:r>
-      <w:r>
-        <w:t xml:space="preserve"> </w:t>
-      </w:r>
-      <w:r>
-        <w:t xml:space="preserve">(value assignment. So using ranks is actually w.l.o.g.)</w:t>
-      </w:r>
-    </w:p>
-    <w:bookmarkEnd w:id="45"/>
-    <w:bookmarkEnd w:id="46"/>
-    <w:bookmarkStart w:id="47" w:name="conclusion"/>
-    <w:p>
-      <w:pPr>
-        <w:pStyle w:val="Heading1"/>
-      </w:pPr>
-      <w:r>
-        <w:t xml:space="preserve">9. Conclusion</w:t>
-      </w:r>
-    </w:p>
-    <w:p>
-      <w:pPr>
-        <w:pStyle w:val="Compact"/>
-        <w:numPr>
-          <w:ilvl w:val="0"/>
-          <w:numId w:val="1051"/>
-        </w:numPr>
-      </w:pPr>
-      <w:r>
-        <w:t xml:space="preserve">Summary: Theoretical bounds, symmetry-breaking conditions, and implications for applied research</w:t>
-      </w:r>
-    </w:p>
-    <w:p>
-      <w:pPr>
-        <w:pStyle w:val="Compact"/>
-        <w:numPr>
-          <w:ilvl w:val="0"/>
-          <w:numId w:val="1051"/>
-        </w:numPr>
-      </w:pPr>
-      <w:r>
-        <w:t xml:space="preserve">An R package accompanies this paper, providing tools to compute max/min bounds and perform randomization-based hypothesis tests for fixed marginals. Details are available in the appendix and online.</w:t>
-      </w:r>
-    </w:p>
-    <w:p>
-      <w:pPr>
-        <w:pStyle w:val="Compact"/>
-        <w:numPr>
-          <w:ilvl w:val="0"/>
-          <w:numId w:val="1051"/>
-        </w:numPr>
-      </w:pPr>
-      <w:r>
-        <w:t xml:space="preserve">Future work: deeper integration with copula models, correction strategies, and generalizations to higher dimensions</w:t>
-      </w:r>
-    </w:p>
-    <w:p>
-      <w:r>
-        <w:br w:type="page"/>
-      </w:r>
-    </w:p>
-    <w:bookmarkEnd w:id="47"/>
-    <w:bookmarkStart w:id="63" w:name="references"/>
-    <w:p>
-      <w:pPr>
-        <w:pStyle w:val="Heading1"/>
-      </w:pPr>
-      <w:r>
         <w:t xml:space="preserve">10. References</w:t>
       </w:r>
     </w:p>
-    <w:bookmarkStart w:id="62" w:name="refs"/>
-    <w:bookmarkStart w:id="49" w:name="ref-camb76-inequalities"/>
+    <w:bookmarkStart w:id="63" w:name="refs"/>
+    <w:bookmarkStart w:id="50" w:name="ref-camb76-inequalities"/>
     <w:p>
       <w:pPr>
         <w:pStyle w:val="Bibliography"/>
@@ -10428,7 +10681,7 @@
       <w:r>
         <w:t xml:space="preserve"> </w:t>
       </w:r>
-      <w:hyperlink r:id="rId48">
+      <w:hyperlink r:id="rId49">
         <w:r>
           <w:rPr>
             <w:rStyle w:val="Hyperlink"/>
@@ -10437,8 +10690,8 @@
         </w:r>
       </w:hyperlink>
     </w:p>
-    <w:bookmarkEnd w:id="49"/>
-    <w:bookmarkStart w:id="50" w:name="ref-frec51-tableaux"/>
+    <w:bookmarkEnd w:id="50"/>
+    <w:bookmarkStart w:id="51" w:name="ref-frec51-tableaux"/>
     <w:p>
       <w:pPr>
         <w:pStyle w:val="Bibliography"/>
@@ -10473,8 +10726,8 @@
         <w:t xml:space="preserve">, 53–77.</w:t>
       </w:r>
     </w:p>
-    <w:bookmarkEnd w:id="50"/>
-    <w:bookmarkStart w:id="51" w:name="ref-hard52-inequalities"/>
+    <w:bookmarkEnd w:id="51"/>
+    <w:bookmarkStart w:id="52" w:name="ref-hard52-inequalities"/>
     <w:p>
       <w:pPr>
         <w:pStyle w:val="Bibliography"/>
@@ -10496,14 +10749,14 @@
         <w:t xml:space="preserve">. Cambridge University Press.</w:t>
       </w:r>
     </w:p>
-    <w:bookmarkEnd w:id="51"/>
-    <w:bookmarkStart w:id="52" w:name="ref-hoef40-masstabinvariante"/>
+    <w:bookmarkEnd w:id="52"/>
+    <w:bookmarkStart w:id="53" w:name="ref-hoef40-masstabinvariante"/>
     <w:p>
       <w:pPr>
         <w:pStyle w:val="Bibliography"/>
       </w:pPr>
       <w:r>
-        <w:t xml:space="preserve">HOEFFDING, W. (1940). Masstabinvariante</w:t>
+        <w:t xml:space="preserve">Hoeffding, W. (1940). Masstabinvariante</w:t>
       </w:r>
       <w:r>
         <w:t xml:space="preserve"> </w:t>
@@ -10541,8 +10794,8 @@
         <w:t xml:space="preserve">, 181–233.</w:t>
       </w:r>
     </w:p>
-    <w:bookmarkEnd w:id="52"/>
-    <w:bookmarkStart w:id="53" w:name="ref-jaec09-positive"/>
+    <w:bookmarkEnd w:id="53"/>
+    <w:bookmarkStart w:id="54" w:name="ref-jaec09-positive"/>
     <w:p>
       <w:pPr>
         <w:pStyle w:val="Bibliography"/>
@@ -10564,8 +10817,8 @@
         <w:t xml:space="preserve">.</w:t>
       </w:r>
     </w:p>
-    <w:bookmarkEnd w:id="53"/>
-    <w:bookmarkStart w:id="54" w:name="ref-lehm66-concepts"/>
+    <w:bookmarkEnd w:id="54"/>
+    <w:bookmarkStart w:id="55" w:name="ref-lehm66-concepts"/>
     <w:p>
       <w:pPr>
         <w:pStyle w:val="Bibliography"/>
@@ -10621,8 +10874,8 @@
         <w:t xml:space="preserve">(5), 1137–1153.</w:t>
       </w:r>
     </w:p>
-    <w:bookmarkEnd w:id="54"/>
-    <w:bookmarkStart w:id="55" w:name="ref-mish09-note"/>
+    <w:bookmarkEnd w:id="55"/>
+    <w:bookmarkStart w:id="56" w:name="ref-mish09-note"/>
     <w:p>
       <w:pPr>
         <w:pStyle w:val="Bibliography"/>
@@ -10644,8 +10897,8 @@
         <w:t xml:space="preserve">.</w:t>
       </w:r>
     </w:p>
-    <w:bookmarkEnd w:id="55"/>
-    <w:bookmarkStart w:id="57" w:name="ref-shan23-impact"/>
+    <w:bookmarkEnd w:id="56"/>
+    <w:bookmarkStart w:id="58" w:name="ref-shan23-impact"/>
     <w:p>
       <w:pPr>
         <w:pStyle w:val="Bibliography"/>
@@ -10736,7 +10989,7 @@
       <w:r>
         <w:t xml:space="preserve"> </w:t>
       </w:r>
-      <w:hyperlink r:id="rId56">
+      <w:hyperlink r:id="rId57">
         <w:r>
           <w:rPr>
             <w:rStyle w:val="Hyperlink"/>
@@ -10745,8 +10998,8 @@
         </w:r>
       </w:hyperlink>
     </w:p>
-    <w:bookmarkEnd w:id="57"/>
-    <w:bookmarkStart w:id="59" w:name="ref-shih92-evaluating"/>
+    <w:bookmarkEnd w:id="58"/>
+    <w:bookmarkStart w:id="60" w:name="ref-shih92-evaluating"/>
     <w:p>
       <w:pPr>
         <w:pStyle w:val="Bibliography"/>
@@ -10804,7 +11057,7 @@
       <w:r>
         <w:t xml:space="preserve"> </w:t>
       </w:r>
-      <w:hyperlink r:id="rId58">
+      <w:hyperlink r:id="rId59">
         <w:r>
           <w:rPr>
             <w:rStyle w:val="Hyperlink"/>
@@ -10813,8 +11066,8 @@
         </w:r>
       </w:hyperlink>
     </w:p>
-    <w:bookmarkEnd w:id="59"/>
-    <w:bookmarkStart w:id="60" w:name="ref-tche80-inequalities"/>
+    <w:bookmarkEnd w:id="60"/>
+    <w:bookmarkStart w:id="61" w:name="ref-tche80-inequalities"/>
     <w:p>
       <w:pPr>
         <w:pStyle w:val="Bibliography"/>
@@ -10870,8 +11123,8 @@
         <w:t xml:space="preserve">(4), 814–827.</w:t>
       </w:r>
     </w:p>
-    <w:bookmarkEnd w:id="60"/>
-    <w:bookmarkStart w:id="61" w:name="ref-whit76-bivariate"/>
+    <w:bookmarkEnd w:id="61"/>
+    <w:bookmarkStart w:id="62" w:name="ref-whit76-bivariate"/>
     <w:p>
       <w:pPr>
         <w:pStyle w:val="Bibliography"/>
@@ -10927,15 +11180,15 @@
         <w:t xml:space="preserve">(6), 1280–1289.</w:t>
       </w:r>
     </w:p>
-    <w:bookmarkEnd w:id="61"/>
     <w:bookmarkEnd w:id="62"/>
+    <w:bookmarkEnd w:id="63"/>
     <w:p>
       <w:r>
         <w:br w:type="page"/>
       </w:r>
     </w:p>
-    <w:bookmarkEnd w:id="63"/>
-    <w:bookmarkStart w:id="64" w:name="appendix-a-mathematical-proofs"/>
+    <w:bookmarkEnd w:id="64"/>
+    <w:bookmarkStart w:id="65" w:name="appendix-a-mathematical-proofs"/>
     <w:p>
       <w:pPr>
         <w:pStyle w:val="Heading1"/>
@@ -10949,15 +11202,15 @@
         <w:pStyle w:val="Compact"/>
         <w:numPr>
           <w:ilvl w:val="0"/>
-          <w:numId w:val="1052"/>
+          <w:numId w:val="1055"/>
         </w:numPr>
       </w:pPr>
       <w:r>
         <w:t xml:space="preserve">Formal derivations of optimal coupling and analytical bounds</w:t>
       </w:r>
     </w:p>
-    <w:bookmarkEnd w:id="64"/>
-    <w:bookmarkStart w:id="65" w:name="Xcbc1e63e2676ae6940216baa962f3b1416b12e5"/>
+    <w:bookmarkEnd w:id="65"/>
+    <w:bookmarkStart w:id="66" w:name="Xcbc1e63e2676ae6940216baa962f3b1416b12e5"/>
     <w:p>
       <w:pPr>
         <w:pStyle w:val="Heading1"/>
@@ -10971,7 +11224,7 @@
         <w:pStyle w:val="Compact"/>
         <w:numPr>
           <w:ilvl w:val="0"/>
-          <w:numId w:val="1053"/>
+          <w:numId w:val="1056"/>
         </w:numPr>
       </w:pPr>
       <w:r>
@@ -10986,15 +11239,15 @@
         <w:pStyle w:val="Compact"/>
         <w:numPr>
           <w:ilvl w:val="0"/>
-          <w:numId w:val="1053"/>
+          <w:numId w:val="1056"/>
         </w:numPr>
       </w:pPr>
       <w:r>
         <w:t xml:space="preserve">Description of randomization testing features</w:t>
       </w:r>
     </w:p>
-    <w:bookmarkEnd w:id="65"/>
-    <w:bookmarkStart w:id="66" w:name="X0fa965c16005f1205fcf7fee981caab2b595cd3"/>
+    <w:bookmarkEnd w:id="66"/>
+    <w:bookmarkStart w:id="67" w:name="X0fa965c16005f1205fcf7fee981caab2b595cd3"/>
     <w:p>
       <w:pPr>
         <w:pStyle w:val="Heading1"/>
@@ -11008,14 +11261,14 @@
         <w:pStyle w:val="Compact"/>
         <w:numPr>
           <w:ilvl w:val="0"/>
-          <w:numId w:val="1054"/>
+          <w:numId w:val="1057"/>
         </w:numPr>
       </w:pPr>
       <w:r>
         <w:t xml:space="preserve">Supplementary empirical examples, simulation results</w:t>
       </w:r>
     </w:p>
-    <w:bookmarkEnd w:id="66"/>
+    <w:bookmarkEnd w:id="67"/>
     <w:sectPr/>
   </w:body>
 </w:document>
@@ -11041,7 +11294,7 @@
       </w:r>
     </w:p>
   </w:footnote>
-  <w:footnote w:id="29">
+  <w:footnote w:id="30">
     <w:p>
       <w:pPr>
         <w:pStyle w:val="FootnoteText"/>
@@ -11950,6 +12203,9 @@
     <w:abstractNumId w:val="991"/>
   </w:num>
   <w:num w:numId="1005">
+    <w:abstractNumId w:val="991"/>
+  </w:num>
+  <w:num w:numId="1006">
     <w:abstractNumId w:val="99413"/>
     <w:lvlOverride w:ilvl="0">
       <w:startOverride w:val="3"/>
@@ -11979,10 +12235,10 @@
       <w:startOverride w:val="3"/>
     </w:lvlOverride>
   </w:num>
-  <w:num w:numId="1006">
+  <w:num w:numId="1007">
     <w:abstractNumId w:val="991"/>
   </w:num>
-  <w:num w:numId="1007">
+  <w:num w:numId="1008">
     <w:abstractNumId w:val="99414"/>
     <w:lvlOverride w:ilvl="0">
       <w:startOverride w:val="4"/>
@@ -12012,10 +12268,10 @@
       <w:startOverride w:val="4"/>
     </w:lvlOverride>
   </w:num>
-  <w:num w:numId="1008">
+  <w:num w:numId="1009">
     <w:abstractNumId w:val="991"/>
   </w:num>
-  <w:num w:numId="1009">
+  <w:num w:numId="1010">
     <w:abstractNumId w:val="99415"/>
     <w:lvlOverride w:ilvl="0">
       <w:startOverride w:val="5"/>
@@ -12045,10 +12301,10 @@
       <w:startOverride w:val="5"/>
     </w:lvlOverride>
   </w:num>
-  <w:num w:numId="1010">
+  <w:num w:numId="1011">
     <w:abstractNumId w:val="991"/>
   </w:num>
-  <w:num w:numId="1011">
+  <w:num w:numId="1012">
     <w:abstractNumId w:val="99416"/>
     <w:lvlOverride w:ilvl="0">
       <w:startOverride w:val="6"/>
@@ -12078,9 +12334,6 @@
       <w:startOverride w:val="6"/>
     </w:lvlOverride>
   </w:num>
-  <w:num w:numId="1012">
-    <w:abstractNumId w:val="991"/>
-  </w:num>
   <w:num w:numId="1013">
     <w:abstractNumId w:val="991"/>
   </w:num>
@@ -12088,6 +12341,9 @@
     <w:abstractNumId w:val="991"/>
   </w:num>
   <w:num w:numId="1015">
+    <w:abstractNumId w:val="991"/>
+  </w:num>
+  <w:num w:numId="1016">
     <w:abstractNumId w:val="99411"/>
     <w:lvlOverride w:ilvl="0">
       <w:startOverride w:val="1"/>
@@ -12117,10 +12373,10 @@
       <w:startOverride w:val="1"/>
     </w:lvlOverride>
   </w:num>
-  <w:num w:numId="1016">
+  <w:num w:numId="1017">
     <w:abstractNumId w:val="991"/>
   </w:num>
-  <w:num w:numId="1017">
+  <w:num w:numId="1018">
     <w:abstractNumId w:val="99417"/>
     <w:lvlOverride w:ilvl="0">
       <w:startOverride w:val="7"/>
@@ -12150,7 +12406,10 @@
       <w:startOverride w:val="7"/>
     </w:lvlOverride>
   </w:num>
-  <w:num w:numId="1018">
+  <w:num w:numId="1019">
+    <w:abstractNumId w:val="991"/>
+  </w:num>
+  <w:num w:numId="1020">
     <w:abstractNumId w:val="99411"/>
     <w:lvlOverride w:ilvl="0">
       <w:startOverride w:val="1"/>
@@ -12180,7 +12439,7 @@
       <w:startOverride w:val="1"/>
     </w:lvlOverride>
   </w:num>
-  <w:num w:numId="1019">
+  <w:num w:numId="1021">
     <w:abstractNumId w:val="99411"/>
     <w:lvlOverride w:ilvl="0">
       <w:startOverride w:val="1"/>
@@ -12210,14 +12469,35 @@
       <w:startOverride w:val="1"/>
     </w:lvlOverride>
   </w:num>
-  <w:num w:numId="1020">
-    <w:abstractNumId w:val="991"/>
-  </w:num>
-  <w:num w:numId="1021">
-    <w:abstractNumId w:val="991"/>
-  </w:num>
   <w:num w:numId="1022">
-    <w:abstractNumId w:val="991"/>
+    <w:abstractNumId w:val="99411"/>
+    <w:lvlOverride w:ilvl="0">
+      <w:startOverride w:val="1"/>
+    </w:lvlOverride>
+    <w:lvlOverride w:ilvl="1">
+      <w:startOverride w:val="1"/>
+    </w:lvlOverride>
+    <w:lvlOverride w:ilvl="2">
+      <w:startOverride w:val="1"/>
+    </w:lvlOverride>
+    <w:lvlOverride w:ilvl="3">
+      <w:startOverride w:val="1"/>
+    </w:lvlOverride>
+    <w:lvlOverride w:ilvl="4">
+      <w:startOverride w:val="1"/>
+    </w:lvlOverride>
+    <w:lvlOverride w:ilvl="5">
+      <w:startOverride w:val="1"/>
+    </w:lvlOverride>
+    <w:lvlOverride w:ilvl="6">
+      <w:startOverride w:val="1"/>
+    </w:lvlOverride>
+    <w:lvlOverride w:ilvl="7">
+      <w:startOverride w:val="1"/>
+    </w:lvlOverride>
+    <w:lvlOverride w:ilvl="8">
+      <w:startOverride w:val="1"/>
+    </w:lvlOverride>
   </w:num>
   <w:num w:numId="1023">
     <w:abstractNumId w:val="991"/>
@@ -12262,6 +12542,15 @@
     <w:abstractNumId w:val="991"/>
   </w:num>
   <w:num w:numId="1037">
+    <w:abstractNumId w:val="991"/>
+  </w:num>
+  <w:num w:numId="1038">
+    <w:abstractNumId w:val="991"/>
+  </w:num>
+  <w:num w:numId="1039">
+    <w:abstractNumId w:val="991"/>
+  </w:num>
+  <w:num w:numId="1040">
     <w:abstractNumId w:val="99411"/>
     <w:lvlOverride w:ilvl="0">
       <w:startOverride w:val="1"/>
@@ -12291,7 +12580,7 @@
       <w:startOverride w:val="1"/>
     </w:lvlOverride>
   </w:num>
-  <w:num w:numId="1038">
+  <w:num w:numId="1041">
     <w:abstractNumId w:val="99411"/>
     <w:lvlOverride w:ilvl="0">
       <w:startOverride w:val="1"/>
@@ -12320,15 +12609,6 @@
     <w:lvlOverride w:ilvl="8">
       <w:startOverride w:val="1"/>
     </w:lvlOverride>
-  </w:num>
-  <w:num w:numId="1039">
-    <w:abstractNumId w:val="991"/>
-  </w:num>
-  <w:num w:numId="1040">
-    <w:abstractNumId w:val="991"/>
-  </w:num>
-  <w:num w:numId="1041">
-    <w:abstractNumId w:val="991"/>
   </w:num>
   <w:num w:numId="1042">
     <w:abstractNumId w:val="991"/>
@@ -12367,6 +12647,15 @@
     <w:abstractNumId w:val="991"/>
   </w:num>
   <w:num w:numId="1054">
+    <w:abstractNumId w:val="991"/>
+  </w:num>
+  <w:num w:numId="1055">
+    <w:abstractNumId w:val="991"/>
+  </w:num>
+  <w:num w:numId="1056">
+    <w:abstractNumId w:val="991"/>
+  </w:num>
+  <w:num w:numId="1057">
     <w:abstractNumId w:val="991"/>
   </w:num>
 </w:numbering>

</xml_diff>